<commit_message>
Docs v1.6: disk sizing by recording mode from lab measurements
Alerts-only (7 days) needs ~12/24 GB for 4/8 cameras: the built-in 512 GB SSD is enough; an extra disk is only needed for continuous recording.

Co-Authored-By: Claude Opus 5.5 <noreply@anthropic.com>
</commit_message>
<xml_diff>
--- a/docs/orbi360/Orbi360_NVR_Documentacion.docx
+++ b/docs/orbi360/Orbi360_NVR_Documentacion.docx
@@ -16,7 +16,7 @@
           <w:noProof/>
         </w:rPr>
         <w:drawing>
-          <wp:inline distT="0" distB="0" distL="0" distR="0" wp14:anchorId="0C3036D6" wp14:editId="30B45462">
+          <wp:inline distT="0" distB="0" distL="0" distR="0" wp14:anchorId="178F09A8" wp14:editId="65723CBC">
             <wp:extent cx="2476500" cy="2066925"/>
             <wp:effectExtent l="0" t="0" r="0" b="0"/>
             <wp:docPr id="1" name="Imagen 1"/>
@@ -156,7 +156,7 @@
     <w:sdt>
       <w:sdtPr>
         <w:alias w:val="Contenido"/>
-        <w:id w:val="-1290192315"/>
+        <w:id w:val="340357102"/>
       </w:sdtPr>
       <w:sdtEndPr/>
       <w:sdtContent>
@@ -184,7 +184,7 @@
           <w:r>
             <w:fldChar w:fldCharType="separate"/>
           </w:r>
-          <w:hyperlink w:anchor="_Toc242703987" w:history="1">
+          <w:hyperlink w:anchor="_Toc242704436" w:history="1">
             <w:r>
               <w:rPr>
                 <w:rStyle w:val="Hipervnculo"/>
@@ -208,7 +208,7 @@
               <w:rPr>
                 <w:noProof/>
               </w:rPr>
-              <w:instrText xml:space="preserve"> PAGEREF _Toc242703987 \h </w:instrText>
+              <w:instrText xml:space="preserve"> PAGEREF _Toc242704436 \h </w:instrText>
             </w:r>
             <w:r>
               <w:rPr>
@@ -250,7 +250,7 @@
               <w14:ligatures w14:val="standardContextual"/>
             </w:rPr>
           </w:pPr>
-          <w:hyperlink w:anchor="_Toc242703988" w:history="1">
+          <w:hyperlink w:anchor="_Toc242704437" w:history="1">
             <w:r>
               <w:rPr>
                 <w:rStyle w:val="Hipervnculo"/>
@@ -274,7 +274,7 @@
               <w:rPr>
                 <w:noProof/>
               </w:rPr>
-              <w:instrText xml:space="preserve"> PAGEREF _Toc242703988 \h </w:instrText>
+              <w:instrText xml:space="preserve"> PAGEREF _Toc242704437 \h </w:instrText>
             </w:r>
             <w:r>
               <w:rPr>
@@ -316,7 +316,7 @@
               <w14:ligatures w14:val="standardContextual"/>
             </w:rPr>
           </w:pPr>
-          <w:hyperlink w:anchor="_Toc242703989" w:history="1">
+          <w:hyperlink w:anchor="_Toc242704438" w:history="1">
             <w:r>
               <w:rPr>
                 <w:rStyle w:val="Hipervnculo"/>
@@ -340,7 +340,7 @@
               <w:rPr>
                 <w:noProof/>
               </w:rPr>
-              <w:instrText xml:space="preserve"> PAGEREF _Toc242703989 \h </w:instrText>
+              <w:instrText xml:space="preserve"> PAGEREF _Toc242704438 \h </w:instrText>
             </w:r>
             <w:r>
               <w:rPr>
@@ -382,7 +382,7 @@
               <w14:ligatures w14:val="standardContextual"/>
             </w:rPr>
           </w:pPr>
-          <w:hyperlink w:anchor="_Toc242703990" w:history="1">
+          <w:hyperlink w:anchor="_Toc242704439" w:history="1">
             <w:r>
               <w:rPr>
                 <w:rStyle w:val="Hipervnculo"/>
@@ -406,7 +406,7 @@
               <w:rPr>
                 <w:noProof/>
               </w:rPr>
-              <w:instrText xml:space="preserve"> PAGEREF _Toc242703990 \h </w:instrText>
+              <w:instrText xml:space="preserve"> PAGEREF _Toc242704439 \h </w:instrText>
             </w:r>
             <w:r>
               <w:rPr>
@@ -448,7 +448,7 @@
               <w14:ligatures w14:val="standardContextual"/>
             </w:rPr>
           </w:pPr>
-          <w:hyperlink w:anchor="_Toc242703991" w:history="1">
+          <w:hyperlink w:anchor="_Toc242704440" w:history="1">
             <w:r>
               <w:rPr>
                 <w:rStyle w:val="Hipervnculo"/>
@@ -472,7 +472,7 @@
               <w:rPr>
                 <w:noProof/>
               </w:rPr>
-              <w:instrText xml:space="preserve"> PAGEREF _Toc242703991 \h </w:instrText>
+              <w:instrText xml:space="preserve"> PAGEREF _Toc242704440 \h </w:instrText>
             </w:r>
             <w:r>
               <w:rPr>
@@ -514,7 +514,7 @@
               <w14:ligatures w14:val="standardContextual"/>
             </w:rPr>
           </w:pPr>
-          <w:hyperlink w:anchor="_Toc242703992" w:history="1">
+          <w:hyperlink w:anchor="_Toc242704441" w:history="1">
             <w:r>
               <w:rPr>
                 <w:rStyle w:val="Hipervnculo"/>
@@ -538,7 +538,7 @@
               <w:rPr>
                 <w:noProof/>
               </w:rPr>
-              <w:instrText xml:space="preserve"> PAGEREF _Toc242703992 \h </w:instrText>
+              <w:instrText xml:space="preserve"> PAGEREF _Toc242704441 \h </w:instrText>
             </w:r>
             <w:r>
               <w:rPr>
@@ -580,7 +580,7 @@
               <w14:ligatures w14:val="standardContextual"/>
             </w:rPr>
           </w:pPr>
-          <w:hyperlink w:anchor="_Toc242703993" w:history="1">
+          <w:hyperlink w:anchor="_Toc242704442" w:history="1">
             <w:r>
               <w:rPr>
                 <w:rStyle w:val="Hipervnculo"/>
@@ -604,7 +604,7 @@
               <w:rPr>
                 <w:noProof/>
               </w:rPr>
-              <w:instrText xml:space="preserve"> PAGEREF _Toc242703993 \h </w:instrText>
+              <w:instrText xml:space="preserve"> PAGEREF _Toc242704442 \h </w:instrText>
             </w:r>
             <w:r>
               <w:rPr>
@@ -646,7 +646,7 @@
               <w14:ligatures w14:val="standardContextual"/>
             </w:rPr>
           </w:pPr>
-          <w:hyperlink w:anchor="_Toc242703994" w:history="1">
+          <w:hyperlink w:anchor="_Toc242704443" w:history="1">
             <w:r>
               <w:rPr>
                 <w:rStyle w:val="Hipervnculo"/>
@@ -670,7 +670,7 @@
               <w:rPr>
                 <w:noProof/>
               </w:rPr>
-              <w:instrText xml:space="preserve"> PAGEREF _Toc242703994 \h </w:instrText>
+              <w:instrText xml:space="preserve"> PAGEREF _Toc242704443 \h </w:instrText>
             </w:r>
             <w:r>
               <w:rPr>
@@ -712,7 +712,7 @@
               <w14:ligatures w14:val="standardContextual"/>
             </w:rPr>
           </w:pPr>
-          <w:hyperlink w:anchor="_Toc242703995" w:history="1">
+          <w:hyperlink w:anchor="_Toc242704444" w:history="1">
             <w:r>
               <w:rPr>
                 <w:rStyle w:val="Hipervnculo"/>
@@ -736,7 +736,7 @@
               <w:rPr>
                 <w:noProof/>
               </w:rPr>
-              <w:instrText xml:space="preserve"> PAGEREF _Toc242703995 \h </w:instrText>
+              <w:instrText xml:space="preserve"> PAGEREF _Toc242704444 \h </w:instrText>
             </w:r>
             <w:r>
               <w:rPr>
@@ -778,7 +778,7 @@
               <w14:ligatures w14:val="standardContextual"/>
             </w:rPr>
           </w:pPr>
-          <w:hyperlink w:anchor="_Toc242703996" w:history="1">
+          <w:hyperlink w:anchor="_Toc242704445" w:history="1">
             <w:r>
               <w:rPr>
                 <w:rStyle w:val="Hipervnculo"/>
@@ -802,7 +802,7 @@
               <w:rPr>
                 <w:noProof/>
               </w:rPr>
-              <w:instrText xml:space="preserve"> PAGEREF _Toc242703996 \h </w:instrText>
+              <w:instrText xml:space="preserve"> PAGEREF _Toc242704445 \h </w:instrText>
             </w:r>
             <w:r>
               <w:rPr>
@@ -844,7 +844,7 @@
               <w14:ligatures w14:val="standardContextual"/>
             </w:rPr>
           </w:pPr>
-          <w:hyperlink w:anchor="_Toc242703997" w:history="1">
+          <w:hyperlink w:anchor="_Toc242704446" w:history="1">
             <w:r>
               <w:rPr>
                 <w:rStyle w:val="Hipervnculo"/>
@@ -868,7 +868,7 @@
               <w:rPr>
                 <w:noProof/>
               </w:rPr>
-              <w:instrText xml:space="preserve"> PAGEREF _Toc242703997 \h </w:instrText>
+              <w:instrText xml:space="preserve"> PAGEREF _Toc242704446 \h </w:instrText>
             </w:r>
             <w:r>
               <w:rPr>
@@ -910,7 +910,7 @@
               <w14:ligatures w14:val="standardContextual"/>
             </w:rPr>
           </w:pPr>
-          <w:hyperlink w:anchor="_Toc242703998" w:history="1">
+          <w:hyperlink w:anchor="_Toc242704447" w:history="1">
             <w:r>
               <w:rPr>
                 <w:rStyle w:val="Hipervnculo"/>
@@ -934,7 +934,7 @@
               <w:rPr>
                 <w:noProof/>
               </w:rPr>
-              <w:instrText xml:space="preserve"> PAGEREF _Toc242703998 \h </w:instrText>
+              <w:instrText xml:space="preserve"> PAGEREF _Toc242704447 \h </w:instrText>
             </w:r>
             <w:r>
               <w:rPr>
@@ -976,7 +976,7 @@
               <w14:ligatures w14:val="standardContextual"/>
             </w:rPr>
           </w:pPr>
-          <w:hyperlink w:anchor="_Toc242703999" w:history="1">
+          <w:hyperlink w:anchor="_Toc242704448" w:history="1">
             <w:r>
               <w:rPr>
                 <w:rStyle w:val="Hipervnculo"/>
@@ -1000,7 +1000,7 @@
               <w:rPr>
                 <w:noProof/>
               </w:rPr>
-              <w:instrText xml:space="preserve"> PAGEREF _Toc242703999 \h </w:instrText>
+              <w:instrText xml:space="preserve"> PAGEREF _Toc242704448 \h </w:instrText>
             </w:r>
             <w:r>
               <w:rPr>
@@ -1042,7 +1042,7 @@
               <w14:ligatures w14:val="standardContextual"/>
             </w:rPr>
           </w:pPr>
-          <w:hyperlink w:anchor="_Toc242704000" w:history="1">
+          <w:hyperlink w:anchor="_Toc242704449" w:history="1">
             <w:r>
               <w:rPr>
                 <w:rStyle w:val="Hipervnculo"/>
@@ -1066,7 +1066,7 @@
               <w:rPr>
                 <w:noProof/>
               </w:rPr>
-              <w:instrText xml:space="preserve"> PAGEREF _Toc242704000 \h </w:instrText>
+              <w:instrText xml:space="preserve"> PAGEREF _Toc242704449 \h </w:instrText>
             </w:r>
             <w:r>
               <w:rPr>
@@ -1108,7 +1108,7 @@
               <w14:ligatures w14:val="standardContextual"/>
             </w:rPr>
           </w:pPr>
-          <w:hyperlink w:anchor="_Toc242704001" w:history="1">
+          <w:hyperlink w:anchor="_Toc242704450" w:history="1">
             <w:r>
               <w:rPr>
                 <w:rStyle w:val="Hipervnculo"/>
@@ -1132,7 +1132,7 @@
               <w:rPr>
                 <w:noProof/>
               </w:rPr>
-              <w:instrText xml:space="preserve"> PAGEREF _Toc242704001 \h </w:instrText>
+              <w:instrText xml:space="preserve"> PAGEREF _Toc242704450 \h </w:instrText>
             </w:r>
             <w:r>
               <w:rPr>
@@ -1174,7 +1174,7 @@
               <w14:ligatures w14:val="standardContextual"/>
             </w:rPr>
           </w:pPr>
-          <w:hyperlink w:anchor="_Toc242704002" w:history="1">
+          <w:hyperlink w:anchor="_Toc242704451" w:history="1">
             <w:r>
               <w:rPr>
                 <w:rStyle w:val="Hipervnculo"/>
@@ -1198,7 +1198,7 @@
               <w:rPr>
                 <w:noProof/>
               </w:rPr>
-              <w:instrText xml:space="preserve"> PAGEREF _Toc242704002 \h </w:instrText>
+              <w:instrText xml:space="preserve"> PAGEREF _Toc242704451 \h </w:instrText>
             </w:r>
             <w:r>
               <w:rPr>
@@ -1240,7 +1240,7 @@
               <w14:ligatures w14:val="standardContextual"/>
             </w:rPr>
           </w:pPr>
-          <w:hyperlink w:anchor="_Toc242704003" w:history="1">
+          <w:hyperlink w:anchor="_Toc242704452" w:history="1">
             <w:r>
               <w:rPr>
                 <w:rStyle w:val="Hipervnculo"/>
@@ -1264,7 +1264,7 @@
               <w:rPr>
                 <w:noProof/>
               </w:rPr>
-              <w:instrText xml:space="preserve"> PAGEREF _Toc242704003 \h </w:instrText>
+              <w:instrText xml:space="preserve"> PAGEREF _Toc242704452 \h </w:instrText>
             </w:r>
             <w:r>
               <w:rPr>
@@ -1306,7 +1306,7 @@
               <w14:ligatures w14:val="standardContextual"/>
             </w:rPr>
           </w:pPr>
-          <w:hyperlink w:anchor="_Toc242704004" w:history="1">
+          <w:hyperlink w:anchor="_Toc242704453" w:history="1">
             <w:r>
               <w:rPr>
                 <w:rStyle w:val="Hipervnculo"/>
@@ -1330,7 +1330,7 @@
               <w:rPr>
                 <w:noProof/>
               </w:rPr>
-              <w:instrText xml:space="preserve"> PAGEREF _Toc242704004 \h </w:instrText>
+              <w:instrText xml:space="preserve"> PAGEREF _Toc242704453 \h </w:instrText>
             </w:r>
             <w:r>
               <w:rPr>
@@ -1372,7 +1372,7 @@
               <w14:ligatures w14:val="standardContextual"/>
             </w:rPr>
           </w:pPr>
-          <w:hyperlink w:anchor="_Toc242704005" w:history="1">
+          <w:hyperlink w:anchor="_Toc242704454" w:history="1">
             <w:r>
               <w:rPr>
                 <w:rStyle w:val="Hipervnculo"/>
@@ -1396,7 +1396,7 @@
               <w:rPr>
                 <w:noProof/>
               </w:rPr>
-              <w:instrText xml:space="preserve"> PAGEREF _Toc242704005 \h </w:instrText>
+              <w:instrText xml:space="preserve"> PAGEREF _Toc242704454 \h </w:instrText>
             </w:r>
             <w:r>
               <w:rPr>
@@ -1438,7 +1438,7 @@
               <w14:ligatures w14:val="standardContextual"/>
             </w:rPr>
           </w:pPr>
-          <w:hyperlink w:anchor="_Toc242704006" w:history="1">
+          <w:hyperlink w:anchor="_Toc242704455" w:history="1">
             <w:r>
               <w:rPr>
                 <w:rStyle w:val="Hipervnculo"/>
@@ -1462,7 +1462,7 @@
               <w:rPr>
                 <w:noProof/>
               </w:rPr>
-              <w:instrText xml:space="preserve"> PAGEREF _Toc242704006 \h </w:instrText>
+              <w:instrText xml:space="preserve"> PAGEREF _Toc242704455 \h </w:instrText>
             </w:r>
             <w:r>
               <w:rPr>
@@ -1504,7 +1504,7 @@
               <w14:ligatures w14:val="standardContextual"/>
             </w:rPr>
           </w:pPr>
-          <w:hyperlink w:anchor="_Toc242704007" w:history="1">
+          <w:hyperlink w:anchor="_Toc242704456" w:history="1">
             <w:r>
               <w:rPr>
                 <w:rStyle w:val="Hipervnculo"/>
@@ -1528,7 +1528,7 @@
               <w:rPr>
                 <w:noProof/>
               </w:rPr>
-              <w:instrText xml:space="preserve"> PAGEREF _Toc242704007 \h </w:instrText>
+              <w:instrText xml:space="preserve"> PAGEREF _Toc242704456 \h </w:instrText>
             </w:r>
             <w:r>
               <w:rPr>
@@ -1570,7 +1570,7 @@
               <w14:ligatures w14:val="standardContextual"/>
             </w:rPr>
           </w:pPr>
-          <w:hyperlink w:anchor="_Toc242704008" w:history="1">
+          <w:hyperlink w:anchor="_Toc242704457" w:history="1">
             <w:r>
               <w:rPr>
                 <w:rStyle w:val="Hipervnculo"/>
@@ -1594,7 +1594,7 @@
               <w:rPr>
                 <w:noProof/>
               </w:rPr>
-              <w:instrText xml:space="preserve"> PAGEREF _Toc242704008 \h </w:instrText>
+              <w:instrText xml:space="preserve"> PAGEREF _Toc242704457 \h </w:instrText>
             </w:r>
             <w:r>
               <w:rPr>
@@ -1636,7 +1636,7 @@
               <w14:ligatures w14:val="standardContextual"/>
             </w:rPr>
           </w:pPr>
-          <w:hyperlink w:anchor="_Toc242704009" w:history="1">
+          <w:hyperlink w:anchor="_Toc242704458" w:history="1">
             <w:r>
               <w:rPr>
                 <w:rStyle w:val="Hipervnculo"/>
@@ -1660,7 +1660,7 @@
               <w:rPr>
                 <w:noProof/>
               </w:rPr>
-              <w:instrText xml:space="preserve"> PAGEREF _Toc242704009 \h </w:instrText>
+              <w:instrText xml:space="preserve"> PAGEREF _Toc242704458 \h </w:instrText>
             </w:r>
             <w:r>
               <w:rPr>
@@ -1702,7 +1702,7 @@
               <w14:ligatures w14:val="standardContextual"/>
             </w:rPr>
           </w:pPr>
-          <w:hyperlink w:anchor="_Toc242704010" w:history="1">
+          <w:hyperlink w:anchor="_Toc242704459" w:history="1">
             <w:r>
               <w:rPr>
                 <w:rStyle w:val="Hipervnculo"/>
@@ -1726,7 +1726,7 @@
               <w:rPr>
                 <w:noProof/>
               </w:rPr>
-              <w:instrText xml:space="preserve"> PAGEREF _Toc242704010 \h </w:instrText>
+              <w:instrText xml:space="preserve"> PAGEREF _Toc242704459 \h </w:instrText>
             </w:r>
             <w:r>
               <w:rPr>
@@ -1768,7 +1768,7 @@
               <w14:ligatures w14:val="standardContextual"/>
             </w:rPr>
           </w:pPr>
-          <w:hyperlink w:anchor="_Toc242704011" w:history="1">
+          <w:hyperlink w:anchor="_Toc242704460" w:history="1">
             <w:r>
               <w:rPr>
                 <w:rStyle w:val="Hipervnculo"/>
@@ -1792,7 +1792,7 @@
               <w:rPr>
                 <w:noProof/>
               </w:rPr>
-              <w:instrText xml:space="preserve"> PAGEREF _Toc242704011 \h </w:instrText>
+              <w:instrText xml:space="preserve"> PAGEREF _Toc242704460 \h </w:instrText>
             </w:r>
             <w:r>
               <w:rPr>
@@ -1834,7 +1834,7 @@
               <w14:ligatures w14:val="standardContextual"/>
             </w:rPr>
           </w:pPr>
-          <w:hyperlink w:anchor="_Toc242704012" w:history="1">
+          <w:hyperlink w:anchor="_Toc242704461" w:history="1">
             <w:r>
               <w:rPr>
                 <w:rStyle w:val="Hipervnculo"/>
@@ -1858,7 +1858,7 @@
               <w:rPr>
                 <w:noProof/>
               </w:rPr>
-              <w:instrText xml:space="preserve"> PAGEREF _Toc242704012 \h </w:instrText>
+              <w:instrText xml:space="preserve"> PAGEREF _Toc242704461 \h </w:instrText>
             </w:r>
             <w:r>
               <w:rPr>
@@ -1900,7 +1900,7 @@
               <w14:ligatures w14:val="standardContextual"/>
             </w:rPr>
           </w:pPr>
-          <w:hyperlink w:anchor="_Toc242704013" w:history="1">
+          <w:hyperlink w:anchor="_Toc242704462" w:history="1">
             <w:r>
               <w:rPr>
                 <w:rStyle w:val="Hipervnculo"/>
@@ -1924,7 +1924,7 @@
               <w:rPr>
                 <w:noProof/>
               </w:rPr>
-              <w:instrText xml:space="preserve"> PAGEREF _Toc242704013 \h </w:instrText>
+              <w:instrText xml:space="preserve"> PAGEREF _Toc242704462 \h </w:instrText>
             </w:r>
             <w:r>
               <w:rPr>
@@ -1966,7 +1966,7 @@
               <w14:ligatures w14:val="standardContextual"/>
             </w:rPr>
           </w:pPr>
-          <w:hyperlink w:anchor="_Toc242704014" w:history="1">
+          <w:hyperlink w:anchor="_Toc242704463" w:history="1">
             <w:r>
               <w:rPr>
                 <w:rStyle w:val="Hipervnculo"/>
@@ -1990,7 +1990,7 @@
               <w:rPr>
                 <w:noProof/>
               </w:rPr>
-              <w:instrText xml:space="preserve"> PAGEREF _Toc242704014 \h </w:instrText>
+              <w:instrText xml:space="preserve"> PAGEREF _Toc242704463 \h </w:instrText>
             </w:r>
             <w:r>
               <w:rPr>
@@ -2032,7 +2032,7 @@
               <w14:ligatures w14:val="standardContextual"/>
             </w:rPr>
           </w:pPr>
-          <w:hyperlink w:anchor="_Toc242704015" w:history="1">
+          <w:hyperlink w:anchor="_Toc242704464" w:history="1">
             <w:r>
               <w:rPr>
                 <w:rStyle w:val="Hipervnculo"/>
@@ -2056,7 +2056,7 @@
               <w:rPr>
                 <w:noProof/>
               </w:rPr>
-              <w:instrText xml:space="preserve"> PAGEREF _Toc242704015 \h </w:instrText>
+              <w:instrText xml:space="preserve"> PAGEREF _Toc242704464 \h </w:instrText>
             </w:r>
             <w:r>
               <w:rPr>
@@ -2098,7 +2098,7 @@
               <w14:ligatures w14:val="standardContextual"/>
             </w:rPr>
           </w:pPr>
-          <w:hyperlink w:anchor="_Toc242704016" w:history="1">
+          <w:hyperlink w:anchor="_Toc242704465" w:history="1">
             <w:r>
               <w:rPr>
                 <w:rStyle w:val="Hipervnculo"/>
@@ -2122,7 +2122,7 @@
               <w:rPr>
                 <w:noProof/>
               </w:rPr>
-              <w:instrText xml:space="preserve"> PAGEREF _Toc242704016 \h </w:instrText>
+              <w:instrText xml:space="preserve"> PAGEREF _Toc242704465 \h </w:instrText>
             </w:r>
             <w:r>
               <w:rPr>
@@ -2164,7 +2164,7 @@
               <w14:ligatures w14:val="standardContextual"/>
             </w:rPr>
           </w:pPr>
-          <w:hyperlink w:anchor="_Toc242704017" w:history="1">
+          <w:hyperlink w:anchor="_Toc242704466" w:history="1">
             <w:r>
               <w:rPr>
                 <w:rStyle w:val="Hipervnculo"/>
@@ -2188,7 +2188,7 @@
               <w:rPr>
                 <w:noProof/>
               </w:rPr>
-              <w:instrText xml:space="preserve"> PAGEREF _Toc242704017 \h </w:instrText>
+              <w:instrText xml:space="preserve"> PAGEREF _Toc242704466 \h </w:instrText>
             </w:r>
             <w:r>
               <w:rPr>
@@ -2230,7 +2230,7 @@
               <w14:ligatures w14:val="standardContextual"/>
             </w:rPr>
           </w:pPr>
-          <w:hyperlink w:anchor="_Toc242704018" w:history="1">
+          <w:hyperlink w:anchor="_Toc242704467" w:history="1">
             <w:r>
               <w:rPr>
                 <w:rStyle w:val="Hipervnculo"/>
@@ -2254,7 +2254,7 @@
               <w:rPr>
                 <w:noProof/>
               </w:rPr>
-              <w:instrText xml:space="preserve"> PAGEREF _Toc242704018 \h </w:instrText>
+              <w:instrText xml:space="preserve"> PAGEREF _Toc242704467 \h </w:instrText>
             </w:r>
             <w:r>
               <w:rPr>
@@ -2296,7 +2296,7 @@
               <w14:ligatures w14:val="standardContextual"/>
             </w:rPr>
           </w:pPr>
-          <w:hyperlink w:anchor="_Toc242704019" w:history="1">
+          <w:hyperlink w:anchor="_Toc242704468" w:history="1">
             <w:r>
               <w:rPr>
                 <w:rStyle w:val="Hipervnculo"/>
@@ -2320,7 +2320,7 @@
               <w:rPr>
                 <w:noProof/>
               </w:rPr>
-              <w:instrText xml:space="preserve"> PAGEREF _Toc242704019 \h </w:instrText>
+              <w:instrText xml:space="preserve"> PAGEREF _Toc242704468 \h </w:instrText>
             </w:r>
             <w:r>
               <w:rPr>
@@ -2362,7 +2362,7 @@
               <w14:ligatures w14:val="standardContextual"/>
             </w:rPr>
           </w:pPr>
-          <w:hyperlink w:anchor="_Toc242704020" w:history="1">
+          <w:hyperlink w:anchor="_Toc242704469" w:history="1">
             <w:r>
               <w:rPr>
                 <w:rStyle w:val="Hipervnculo"/>
@@ -2386,7 +2386,7 @@
               <w:rPr>
                 <w:noProof/>
               </w:rPr>
-              <w:instrText xml:space="preserve"> PAGEREF _Toc242704020 \h </w:instrText>
+              <w:instrText xml:space="preserve"> PAGEREF _Toc242704469 \h </w:instrText>
             </w:r>
             <w:r>
               <w:rPr>
@@ -2428,7 +2428,7 @@
               <w14:ligatures w14:val="standardContextual"/>
             </w:rPr>
           </w:pPr>
-          <w:hyperlink w:anchor="_Toc242704021" w:history="1">
+          <w:hyperlink w:anchor="_Toc242704470" w:history="1">
             <w:r>
               <w:rPr>
                 <w:rStyle w:val="Hipervnculo"/>
@@ -2452,7 +2452,7 @@
               <w:rPr>
                 <w:noProof/>
               </w:rPr>
-              <w:instrText xml:space="preserve"> PAGEREF _Toc242704021 \h </w:instrText>
+              <w:instrText xml:space="preserve"> PAGEREF _Toc242704470 \h </w:instrText>
             </w:r>
             <w:r>
               <w:rPr>
@@ -2494,7 +2494,7 @@
               <w14:ligatures w14:val="standardContextual"/>
             </w:rPr>
           </w:pPr>
-          <w:hyperlink w:anchor="_Toc242704022" w:history="1">
+          <w:hyperlink w:anchor="_Toc242704471" w:history="1">
             <w:r>
               <w:rPr>
                 <w:rStyle w:val="Hipervnculo"/>
@@ -2518,7 +2518,7 @@
               <w:rPr>
                 <w:noProof/>
               </w:rPr>
-              <w:instrText xml:space="preserve"> PAGEREF _Toc242704022 \h </w:instrText>
+              <w:instrText xml:space="preserve"> PAGEREF _Toc242704471 \h </w:instrText>
             </w:r>
             <w:r>
               <w:rPr>
@@ -2560,7 +2560,7 @@
               <w14:ligatures w14:val="standardContextual"/>
             </w:rPr>
           </w:pPr>
-          <w:hyperlink w:anchor="_Toc242704023" w:history="1">
+          <w:hyperlink w:anchor="_Toc242704472" w:history="1">
             <w:r>
               <w:rPr>
                 <w:rStyle w:val="Hipervnculo"/>
@@ -2584,7 +2584,7 @@
               <w:rPr>
                 <w:noProof/>
               </w:rPr>
-              <w:instrText xml:space="preserve"> PAGEREF _Toc242704023 \h </w:instrText>
+              <w:instrText xml:space="preserve"> PAGEREF _Toc242704472 \h </w:instrText>
             </w:r>
             <w:r>
               <w:rPr>
@@ -2626,7 +2626,7 @@
               <w14:ligatures w14:val="standardContextual"/>
             </w:rPr>
           </w:pPr>
-          <w:hyperlink w:anchor="_Toc242704024" w:history="1">
+          <w:hyperlink w:anchor="_Toc242704473" w:history="1">
             <w:r>
               <w:rPr>
                 <w:rStyle w:val="Hipervnculo"/>
@@ -2650,7 +2650,7 @@
               <w:rPr>
                 <w:noProof/>
               </w:rPr>
-              <w:instrText xml:space="preserve"> PAGEREF _Toc242704024 \h </w:instrText>
+              <w:instrText xml:space="preserve"> PAGEREF _Toc242704473 \h </w:instrText>
             </w:r>
             <w:r>
               <w:rPr>
@@ -2692,7 +2692,7 @@
               <w14:ligatures w14:val="standardContextual"/>
             </w:rPr>
           </w:pPr>
-          <w:hyperlink w:anchor="_Toc242704025" w:history="1">
+          <w:hyperlink w:anchor="_Toc242704474" w:history="1">
             <w:r>
               <w:rPr>
                 <w:rStyle w:val="Hipervnculo"/>
@@ -2716,7 +2716,7 @@
               <w:rPr>
                 <w:noProof/>
               </w:rPr>
-              <w:instrText xml:space="preserve"> PAGEREF _Toc242704025 \h </w:instrText>
+              <w:instrText xml:space="preserve"> PAGEREF _Toc242704474 \h </w:instrText>
             </w:r>
             <w:r>
               <w:rPr>
@@ -2758,7 +2758,7 @@
               <w14:ligatures w14:val="standardContextual"/>
             </w:rPr>
           </w:pPr>
-          <w:hyperlink w:anchor="_Toc242704026" w:history="1">
+          <w:hyperlink w:anchor="_Toc242704475" w:history="1">
             <w:r>
               <w:rPr>
                 <w:rStyle w:val="Hipervnculo"/>
@@ -2782,7 +2782,7 @@
               <w:rPr>
                 <w:noProof/>
               </w:rPr>
-              <w:instrText xml:space="preserve"> PAGEREF _Toc242704026 \h </w:instrText>
+              <w:instrText xml:space="preserve"> PAGEREF _Toc242704475 \h </w:instrText>
             </w:r>
             <w:r>
               <w:rPr>
@@ -2824,7 +2824,7 @@
               <w14:ligatures w14:val="standardContextual"/>
             </w:rPr>
           </w:pPr>
-          <w:hyperlink w:anchor="_Toc242704027" w:history="1">
+          <w:hyperlink w:anchor="_Toc242704476" w:history="1">
             <w:r>
               <w:rPr>
                 <w:rStyle w:val="Hipervnculo"/>
@@ -2848,7 +2848,7 @@
               <w:rPr>
                 <w:noProof/>
               </w:rPr>
-              <w:instrText xml:space="preserve"> PAGEREF _Toc242704027 \h </w:instrText>
+              <w:instrText xml:space="preserve"> PAGEREF _Toc242704476 \h </w:instrText>
             </w:r>
             <w:r>
               <w:rPr>
@@ -2890,7 +2890,7 @@
               <w14:ligatures w14:val="standardContextual"/>
             </w:rPr>
           </w:pPr>
-          <w:hyperlink w:anchor="_Toc242704028" w:history="1">
+          <w:hyperlink w:anchor="_Toc242704477" w:history="1">
             <w:r>
               <w:rPr>
                 <w:rStyle w:val="Hipervnculo"/>
@@ -2914,7 +2914,7 @@
               <w:rPr>
                 <w:noProof/>
               </w:rPr>
-              <w:instrText xml:space="preserve"> PAGEREF _Toc242704028 \h </w:instrText>
+              <w:instrText xml:space="preserve"> PAGEREF _Toc242704477 \h </w:instrText>
             </w:r>
             <w:r>
               <w:rPr>
@@ -2956,7 +2956,7 @@
               <w14:ligatures w14:val="standardContextual"/>
             </w:rPr>
           </w:pPr>
-          <w:hyperlink w:anchor="_Toc242704029" w:history="1">
+          <w:hyperlink w:anchor="_Toc242704478" w:history="1">
             <w:r>
               <w:rPr>
                 <w:rStyle w:val="Hipervnculo"/>
@@ -2980,7 +2980,7 @@
               <w:rPr>
                 <w:noProof/>
               </w:rPr>
-              <w:instrText xml:space="preserve"> PAGEREF _Toc242704029 \h </w:instrText>
+              <w:instrText xml:space="preserve"> PAGEREF _Toc242704478 \h </w:instrText>
             </w:r>
             <w:r>
               <w:rPr>
@@ -3022,7 +3022,7 @@
               <w14:ligatures w14:val="standardContextual"/>
             </w:rPr>
           </w:pPr>
-          <w:hyperlink w:anchor="_Toc242704030" w:history="1">
+          <w:hyperlink w:anchor="_Toc242704479" w:history="1">
             <w:r>
               <w:rPr>
                 <w:rStyle w:val="Hipervnculo"/>
@@ -3046,7 +3046,7 @@
               <w:rPr>
                 <w:noProof/>
               </w:rPr>
-              <w:instrText xml:space="preserve"> PAGEREF _Toc242704030 \h </w:instrText>
+              <w:instrText xml:space="preserve"> PAGEREF _Toc242704479 \h </w:instrText>
             </w:r>
             <w:r>
               <w:rPr>
@@ -3088,7 +3088,7 @@
               <w14:ligatures w14:val="standardContextual"/>
             </w:rPr>
           </w:pPr>
-          <w:hyperlink w:anchor="_Toc242704031" w:history="1">
+          <w:hyperlink w:anchor="_Toc242704480" w:history="1">
             <w:r>
               <w:rPr>
                 <w:rStyle w:val="Hipervnculo"/>
@@ -3112,7 +3112,7 @@
               <w:rPr>
                 <w:noProof/>
               </w:rPr>
-              <w:instrText xml:space="preserve"> PAGEREF _Toc242704031 \h </w:instrText>
+              <w:instrText xml:space="preserve"> PAGEREF _Toc242704480 \h </w:instrText>
             </w:r>
             <w:r>
               <w:rPr>
@@ -3154,7 +3154,7 @@
               <w14:ligatures w14:val="standardContextual"/>
             </w:rPr>
           </w:pPr>
-          <w:hyperlink w:anchor="_Toc242704032" w:history="1">
+          <w:hyperlink w:anchor="_Toc242704481" w:history="1">
             <w:r>
               <w:rPr>
                 <w:rStyle w:val="Hipervnculo"/>
@@ -3178,7 +3178,7 @@
               <w:rPr>
                 <w:noProof/>
               </w:rPr>
-              <w:instrText xml:space="preserve"> PAGEREF _Toc242704032 \h </w:instrText>
+              <w:instrText xml:space="preserve"> PAGEREF _Toc242704481 \h </w:instrText>
             </w:r>
             <w:r>
               <w:rPr>
@@ -3220,7 +3220,7 @@
               <w14:ligatures w14:val="standardContextual"/>
             </w:rPr>
           </w:pPr>
-          <w:hyperlink w:anchor="_Toc242704033" w:history="1">
+          <w:hyperlink w:anchor="_Toc242704482" w:history="1">
             <w:r>
               <w:rPr>
                 <w:rStyle w:val="Hipervnculo"/>
@@ -3244,7 +3244,7 @@
               <w:rPr>
                 <w:noProof/>
               </w:rPr>
-              <w:instrText xml:space="preserve"> PAGEREF _Toc242704033 \h </w:instrText>
+              <w:instrText xml:space="preserve"> PAGEREF _Toc242704482 \h </w:instrText>
             </w:r>
             <w:r>
               <w:rPr>
@@ -3286,7 +3286,7 @@
               <w14:ligatures w14:val="standardContextual"/>
             </w:rPr>
           </w:pPr>
-          <w:hyperlink w:anchor="_Toc242704034" w:history="1">
+          <w:hyperlink w:anchor="_Toc242704483" w:history="1">
             <w:r>
               <w:rPr>
                 <w:rStyle w:val="Hipervnculo"/>
@@ -3310,7 +3310,7 @@
               <w:rPr>
                 <w:noProof/>
               </w:rPr>
-              <w:instrText xml:space="preserve"> PAGEREF _Toc242704034 \h </w:instrText>
+              <w:instrText xml:space="preserve"> PAGEREF _Toc242704483 \h </w:instrText>
             </w:r>
             <w:r>
               <w:rPr>
@@ -3352,7 +3352,7 @@
               <w14:ligatures w14:val="standardContextual"/>
             </w:rPr>
           </w:pPr>
-          <w:hyperlink w:anchor="_Toc242704035" w:history="1">
+          <w:hyperlink w:anchor="_Toc242704484" w:history="1">
             <w:r>
               <w:rPr>
                 <w:rStyle w:val="Hipervnculo"/>
@@ -3376,7 +3376,7 @@
               <w:rPr>
                 <w:noProof/>
               </w:rPr>
-              <w:instrText xml:space="preserve"> PAGEREF _Toc242704035 \h </w:instrText>
+              <w:instrText xml:space="preserve"> PAGEREF _Toc242704484 \h </w:instrText>
             </w:r>
             <w:r>
               <w:rPr>
@@ -3418,7 +3418,7 @@
               <w14:ligatures w14:val="standardContextual"/>
             </w:rPr>
           </w:pPr>
-          <w:hyperlink w:anchor="_Toc242704036" w:history="1">
+          <w:hyperlink w:anchor="_Toc242704485" w:history="1">
             <w:r>
               <w:rPr>
                 <w:rStyle w:val="Hipervnculo"/>
@@ -3442,7 +3442,7 @@
               <w:rPr>
                 <w:noProof/>
               </w:rPr>
-              <w:instrText xml:space="preserve"> PAGEREF _Toc242704036 \h </w:instrText>
+              <w:instrText xml:space="preserve"> PAGEREF _Toc242704485 \h </w:instrText>
             </w:r>
             <w:r>
               <w:rPr>
@@ -3484,7 +3484,7 @@
               <w14:ligatures w14:val="standardContextual"/>
             </w:rPr>
           </w:pPr>
-          <w:hyperlink w:anchor="_Toc242704037" w:history="1">
+          <w:hyperlink w:anchor="_Toc242704486" w:history="1">
             <w:r>
               <w:rPr>
                 <w:rStyle w:val="Hipervnculo"/>
@@ -3508,7 +3508,7 @@
               <w:rPr>
                 <w:noProof/>
               </w:rPr>
-              <w:instrText xml:space="preserve"> PAGEREF _Toc242704037 \h </w:instrText>
+              <w:instrText xml:space="preserve"> PAGEREF _Toc242704486 \h </w:instrText>
             </w:r>
             <w:r>
               <w:rPr>
@@ -3550,7 +3550,7 @@
               <w14:ligatures w14:val="standardContextual"/>
             </w:rPr>
           </w:pPr>
-          <w:hyperlink w:anchor="_Toc242704038" w:history="1">
+          <w:hyperlink w:anchor="_Toc242704487" w:history="1">
             <w:r>
               <w:rPr>
                 <w:rStyle w:val="Hipervnculo"/>
@@ -3574,7 +3574,7 @@
               <w:rPr>
                 <w:noProof/>
               </w:rPr>
-              <w:instrText xml:space="preserve"> PAGEREF _Toc242704038 \h </w:instrText>
+              <w:instrText xml:space="preserve"> PAGEREF _Toc242704487 \h </w:instrText>
             </w:r>
             <w:r>
               <w:rPr>
@@ -3616,7 +3616,7 @@
               <w14:ligatures w14:val="standardContextual"/>
             </w:rPr>
           </w:pPr>
-          <w:hyperlink w:anchor="_Toc242704039" w:history="1">
+          <w:hyperlink w:anchor="_Toc242704488" w:history="1">
             <w:r>
               <w:rPr>
                 <w:rStyle w:val="Hipervnculo"/>
@@ -3640,7 +3640,7 @@
               <w:rPr>
                 <w:noProof/>
               </w:rPr>
-              <w:instrText xml:space="preserve"> PAGEREF _Toc242704039 \h </w:instrText>
+              <w:instrText xml:space="preserve"> PAGEREF _Toc242704488 \h </w:instrText>
             </w:r>
             <w:r>
               <w:rPr>
@@ -3682,7 +3682,7 @@
               <w14:ligatures w14:val="standardContextual"/>
             </w:rPr>
           </w:pPr>
-          <w:hyperlink w:anchor="_Toc242704040" w:history="1">
+          <w:hyperlink w:anchor="_Toc242704489" w:history="1">
             <w:r>
               <w:rPr>
                 <w:rStyle w:val="Hipervnculo"/>
@@ -3706,7 +3706,7 @@
               <w:rPr>
                 <w:noProof/>
               </w:rPr>
-              <w:instrText xml:space="preserve"> PAGEREF _Toc242704040 \h </w:instrText>
+              <w:instrText xml:space="preserve"> PAGEREF _Toc242704489 \h </w:instrText>
             </w:r>
             <w:r>
               <w:rPr>
@@ -3748,12 +3748,78 @@
               <w14:ligatures w14:val="standardContextual"/>
             </w:rPr>
           </w:pPr>
-          <w:hyperlink w:anchor="_Toc242704041" w:history="1">
+          <w:hyperlink w:anchor="_Toc242704490" w:history="1">
             <w:r>
               <w:rPr>
                 <w:rStyle w:val="Hipervnculo"/>
                 <w:noProof/>
               </w:rPr>
+              <w:t>18.4 Disco según el modo de grabación</w:t>
+            </w:r>
+            <w:r>
+              <w:rPr>
+                <w:noProof/>
+              </w:rPr>
+              <w:tab/>
+            </w:r>
+            <w:r>
+              <w:rPr>
+                <w:noProof/>
+              </w:rPr>
+              <w:fldChar w:fldCharType="begin"/>
+            </w:r>
+            <w:r>
+              <w:rPr>
+                <w:noProof/>
+              </w:rPr>
+              <w:instrText xml:space="preserve"> PAGEREF _Toc242704490 \h </w:instrText>
+            </w:r>
+            <w:r>
+              <w:rPr>
+                <w:noProof/>
+              </w:rPr>
+            </w:r>
+            <w:r>
+              <w:rPr>
+                <w:noProof/>
+              </w:rPr>
+              <w:fldChar w:fldCharType="separate"/>
+            </w:r>
+            <w:r>
+              <w:rPr>
+                <w:noProof/>
+              </w:rPr>
+              <w:t>36</w:t>
+            </w:r>
+            <w:r>
+              <w:rPr>
+                <w:noProof/>
+              </w:rPr>
+              <w:fldChar w:fldCharType="end"/>
+            </w:r>
+          </w:hyperlink>
+        </w:p>
+        <w:p>
+          <w:pPr>
+            <w:pStyle w:val="TDC2"/>
+            <w:tabs>
+              <w:tab w:val="right" w:leader="dot" w:pos="9016"/>
+            </w:tabs>
+            <w:rPr>
+              <w:rFonts w:asciiTheme="minorHAnsi" w:eastAsiaTheme="minorEastAsia" w:hAnsiTheme="minorHAnsi" w:cstheme="minorBidi"/>
+              <w:noProof/>
+              <w:kern w:val="2"/>
+              <w:sz w:val="24"/>
+              <w:szCs w:val="24"/>
+              <w14:ligatures w14:val="standardContextual"/>
+            </w:rPr>
+          </w:pPr>
+          <w:hyperlink w:anchor="_Toc242704491" w:history="1">
+            <w:r>
+              <w:rPr>
+                <w:rStyle w:val="Hipervnculo"/>
+                <w:noProof/>
+              </w:rPr>
               <w:t>18.3 Modelos de referencia</w:t>
             </w:r>
             <w:r>
@@ -3772,7 +3838,7 @@
               <w:rPr>
                 <w:noProof/>
               </w:rPr>
-              <w:instrText xml:space="preserve"> PAGEREF _Toc242704041 \h </w:instrText>
+              <w:instrText xml:space="preserve"> PAGEREF _Toc242704491 \h </w:instrText>
             </w:r>
             <w:r>
               <w:rPr>
@@ -3821,7 +3887,7 @@
         <w:pStyle w:val="Ttulo1"/>
         <w:pageBreakBefore/>
       </w:pPr>
-      <w:bookmarkStart w:id="0" w:name="_Toc242703987"/>
+      <w:bookmarkStart w:id="0" w:name="_Toc242704436"/>
       <w:r>
         <w:lastRenderedPageBreak/>
         <w:t>1. Objetivo y alcance</w:t>
@@ -3938,7 +4004,7 @@
         <w:pStyle w:val="Ttulo1"/>
         <w:pageBreakBefore/>
       </w:pPr>
-      <w:bookmarkStart w:id="1" w:name="_Toc242703988"/>
+      <w:bookmarkStart w:id="1" w:name="_Toc242704437"/>
       <w:r>
         <w:lastRenderedPageBreak/>
         <w:t>2. Base de software y licencia</w:t>
@@ -3988,7 +4054,7 @@
           <w:left w:w="10" w:type="dxa"/>
           <w:right w:w="10" w:type="dxa"/>
         </w:tblCellMar>
-        <w:tblLook w:val="04A0" w:firstRow="1" w:lastRow="0" w:firstColumn="1" w:lastColumn="0" w:noHBand="0" w:noVBand="1"/>
+        <w:tblLook w:val="0000" w:firstRow="0" w:lastRow="0" w:firstColumn="0" w:lastColumn="0" w:noHBand="0" w:noVBand="0"/>
       </w:tblPr>
       <w:tblGrid>
         <w:gridCol w:w="1805"/>
@@ -4450,7 +4516,7 @@
         <w:pStyle w:val="Ttulo1"/>
         <w:pageBreakBefore/>
       </w:pPr>
-      <w:bookmarkStart w:id="2" w:name="_Toc242703989"/>
+      <w:bookmarkStart w:id="2" w:name="_Toc242704438"/>
       <w:r>
         <w:lastRenderedPageBreak/>
         <w:t>3. Repositorio y control de versiones</w:t>
@@ -4461,7 +4527,7 @@
       <w:pPr>
         <w:pStyle w:val="Ttulo2"/>
       </w:pPr>
-      <w:bookmarkStart w:id="3" w:name="_Toc242703990"/>
+      <w:bookmarkStart w:id="3" w:name="_Toc242704439"/>
       <w:r>
         <w:t>3.1 Estructura del repositorio</w:t>
       </w:r>
@@ -4482,7 +4548,7 @@
           <w:left w:w="10" w:type="dxa"/>
           <w:right w:w="10" w:type="dxa"/>
         </w:tblCellMar>
-        <w:tblLook w:val="04A0" w:firstRow="1" w:lastRow="0" w:firstColumn="1" w:lastColumn="0" w:noHBand="0" w:noVBand="1"/>
+        <w:tblLook w:val="0000" w:firstRow="0" w:lastRow="0" w:firstColumn="0" w:lastColumn="0" w:noHBand="0" w:noVBand="0"/>
       </w:tblPr>
       <w:tblGrid>
         <w:gridCol w:w="2708"/>
@@ -5094,7 +5160,7 @@
       <w:pPr>
         <w:pStyle w:val="Ttulo2"/>
       </w:pPr>
-      <w:bookmarkStart w:id="4" w:name="_Toc242703991"/>
+      <w:bookmarkStart w:id="4" w:name="_Toc242704440"/>
       <w:r>
         <w:t>3.2 Por qué se partió de v0.18.0</w:t>
       </w:r>
@@ -5172,7 +5238,7 @@
       <w:pPr>
         <w:pStyle w:val="Ttulo2"/>
       </w:pPr>
-      <w:bookmarkStart w:id="5" w:name="_Toc242703992"/>
+      <w:bookmarkStart w:id="5" w:name="_Toc242704441"/>
       <w:r>
         <w:t>3.3 Pasos de preparación</w:t>
       </w:r>
@@ -5405,7 +5471,7 @@
       <w:pPr>
         <w:pStyle w:val="Ttulo2"/>
       </w:pPr>
-      <w:bookmarkStart w:id="6" w:name="_Toc242703993"/>
+      <w:bookmarkStart w:id="6" w:name="_Toc242704442"/>
       <w:r>
         <w:t>3.4 Traer actualizaciones del proyecto original</w:t>
       </w:r>
@@ -5519,7 +5585,7 @@
       <w:pPr>
         <w:pStyle w:val="Ttulo2"/>
       </w:pPr>
-      <w:bookmarkStart w:id="7" w:name="_Toc242703994"/>
+      <w:bookmarkStart w:id="7" w:name="_Toc242704443"/>
       <w:r>
         <w:t>3.5 Historial de commits propios (rama orbi360)</w:t>
       </w:r>
@@ -5540,7 +5606,7 @@
           <w:left w:w="10" w:type="dxa"/>
           <w:right w:w="10" w:type="dxa"/>
         </w:tblCellMar>
-        <w:tblLook w:val="04A0" w:firstRow="1" w:lastRow="0" w:firstColumn="1" w:lastColumn="0" w:noHBand="0" w:noVBand="1"/>
+        <w:tblLook w:val="0000" w:firstRow="0" w:lastRow="0" w:firstColumn="0" w:lastColumn="0" w:noHBand="0" w:noVBand="0"/>
       </w:tblPr>
       <w:tblGrid>
         <w:gridCol w:w="1805"/>
@@ -8167,7 +8233,7 @@
         <w:pStyle w:val="Ttulo1"/>
         <w:pageBreakBefore/>
       </w:pPr>
-      <w:bookmarkStart w:id="8" w:name="_Toc242703995"/>
+      <w:bookmarkStart w:id="8" w:name="_Toc242704444"/>
       <w:r>
         <w:lastRenderedPageBreak/>
         <w:t>4. Rebranding de la interfaz web</w:t>
@@ -8197,7 +8263,7 @@
           <w:left w:w="10" w:type="dxa"/>
           <w:right w:w="10" w:type="dxa"/>
         </w:tblCellMar>
-        <w:tblLook w:val="04A0" w:firstRow="1" w:lastRow="0" w:firstColumn="1" w:lastColumn="0" w:noHBand="0" w:noVBand="1"/>
+        <w:tblLook w:val="0000" w:firstRow="0" w:lastRow="0" w:firstColumn="0" w:lastColumn="0" w:noHBand="0" w:noVBand="0"/>
       </w:tblPr>
       <w:tblGrid>
         <w:gridCol w:w="2257"/>
@@ -8757,7 +8823,7 @@
         <w:pStyle w:val="Ttulo1"/>
         <w:pageBreakBefore/>
       </w:pPr>
-      <w:bookmarkStart w:id="9" w:name="_Toc242703996"/>
+      <w:bookmarkStart w:id="9" w:name="_Toc242704445"/>
       <w:r>
         <w:lastRenderedPageBreak/>
         <w:t>5. Hardware y red del laboratorio</w:t>
@@ -8779,7 +8845,7 @@
           <w:left w:w="10" w:type="dxa"/>
           <w:right w:w="10" w:type="dxa"/>
         </w:tblCellMar>
-        <w:tblLook w:val="04A0" w:firstRow="1" w:lastRow="0" w:firstColumn="1" w:lastColumn="0" w:noHBand="0" w:noVBand="1"/>
+        <w:tblLook w:val="0000" w:firstRow="0" w:lastRow="0" w:firstColumn="0" w:lastColumn="0" w:noHBand="0" w:noVBand="0"/>
       </w:tblPr>
       <w:tblGrid>
         <w:gridCol w:w="2708"/>
@@ -9422,7 +9488,7 @@
         <w:pStyle w:val="Ttulo1"/>
         <w:pageBreakBefore/>
       </w:pPr>
-      <w:bookmarkStart w:id="10" w:name="_Toc242703997"/>
+      <w:bookmarkStart w:id="10" w:name="_Toc242704446"/>
       <w:r>
         <w:lastRenderedPageBreak/>
         <w:t>6. Creación del contenedor LXC</w:t>
@@ -9463,7 +9529,7 @@
       <w:pPr>
         <w:pStyle w:val="Ttulo2"/>
       </w:pPr>
-      <w:bookmarkStart w:id="11" w:name="_Toc242703998"/>
+      <w:bookmarkStart w:id="11" w:name="_Toc242704447"/>
       <w:r>
         <w:t>6.1 Pasos</w:t>
       </w:r>
@@ -9648,7 +9714,7 @@
       <w:pPr>
         <w:pStyle w:val="Ttulo2"/>
       </w:pPr>
-      <w:bookmarkStart w:id="12" w:name="_Toc242703999"/>
+      <w:bookmarkStart w:id="12" w:name="_Toc242704448"/>
       <w:r>
         <w:t>6.2 Parámetros del contenedor</w:t>
       </w:r>
@@ -9669,7 +9735,7 @@
           <w:left w:w="10" w:type="dxa"/>
           <w:right w:w="10" w:type="dxa"/>
         </w:tblCellMar>
-        <w:tblLook w:val="04A0" w:firstRow="1" w:lastRow="0" w:firstColumn="1" w:lastColumn="0" w:noHBand="0" w:noVBand="1"/>
+        <w:tblLook w:val="0000" w:firstRow="0" w:lastRow="0" w:firstColumn="0" w:lastColumn="0" w:noHBand="0" w:noVBand="0"/>
       </w:tblPr>
       <w:tblGrid>
         <w:gridCol w:w="2708"/>
@@ -10509,7 +10575,7 @@
         <w:pStyle w:val="Ttulo1"/>
         <w:pageBreakBefore/>
       </w:pPr>
-      <w:bookmarkStart w:id="13" w:name="_Toc242704000"/>
+      <w:bookmarkStart w:id="13" w:name="_Toc242704449"/>
       <w:r>
         <w:lastRenderedPageBreak/>
         <w:t>7. Instalación nativa (sin Docker)</w:t>
@@ -10584,7 +10650,7 @@
       <w:pPr>
         <w:pStyle w:val="Ttulo2"/>
       </w:pPr>
-      <w:bookmarkStart w:id="14" w:name="_Toc242704001"/>
+      <w:bookmarkStart w:id="14" w:name="_Toc242704450"/>
       <w:r>
         <w:t>7.1 Qué instala</w:t>
       </w:r>
@@ -10605,7 +10671,7 @@
           <w:left w:w="10" w:type="dxa"/>
           <w:right w:w="10" w:type="dxa"/>
         </w:tblCellMar>
-        <w:tblLook w:val="04A0" w:firstRow="1" w:lastRow="0" w:firstColumn="1" w:lastColumn="0" w:noHBand="0" w:noVBand="1"/>
+        <w:tblLook w:val="0000" w:firstRow="0" w:lastRow="0" w:firstColumn="0" w:lastColumn="0" w:noHBand="0" w:noVBand="0"/>
       </w:tblPr>
       <w:tblGrid>
         <w:gridCol w:w="2708"/>
@@ -11362,7 +11428,7 @@
       <w:pPr>
         <w:pStyle w:val="Ttulo2"/>
       </w:pPr>
-      <w:bookmarkStart w:id="15" w:name="_Toc242704002"/>
+      <w:bookmarkStart w:id="15" w:name="_Toc242704451"/>
       <w:r>
         <w:t>7.2 Rutas importantes</w:t>
       </w:r>
@@ -11383,7 +11449,7 @@
           <w:left w:w="10" w:type="dxa"/>
           <w:right w:w="10" w:type="dxa"/>
         </w:tblCellMar>
-        <w:tblLook w:val="04A0" w:firstRow="1" w:lastRow="0" w:firstColumn="1" w:lastColumn="0" w:noHBand="0" w:noVBand="1"/>
+        <w:tblLook w:val="0000" w:firstRow="0" w:lastRow="0" w:firstColumn="0" w:lastColumn="0" w:noHBand="0" w:noVBand="0"/>
       </w:tblPr>
       <w:tblGrid>
         <w:gridCol w:w="3610"/>
@@ -11858,7 +11924,7 @@
       <w:pPr>
         <w:pStyle w:val="Ttulo2"/>
       </w:pPr>
-      <w:bookmarkStart w:id="16" w:name="_Toc242704003"/>
+      <w:bookmarkStart w:id="16" w:name="_Toc242704452"/>
       <w:r>
         <w:t>7.3 Comportamiento idempotente</w:t>
       </w:r>
@@ -11970,7 +12036,7 @@
       <w:pPr>
         <w:pStyle w:val="Ttulo2"/>
       </w:pPr>
-      <w:bookmarkStart w:id="17" w:name="_Toc242704004"/>
+      <w:bookmarkStart w:id="17" w:name="_Toc242704453"/>
       <w:r>
         <w:lastRenderedPageBreak/>
         <w:t>7.4 Primer acceso</w:t>
@@ -12049,7 +12115,7 @@
         <w:pStyle w:val="Ttulo1"/>
         <w:pageBreakBefore/>
       </w:pPr>
-      <w:bookmarkStart w:id="18" w:name="_Toc242704005"/>
+      <w:bookmarkStart w:id="18" w:name="_Toc242704454"/>
       <w:r>
         <w:lastRenderedPageBreak/>
         <w:t>8. Pruebas previas</w:t>
@@ -12167,7 +12233,7 @@
         <w:pStyle w:val="Ttulo1"/>
         <w:pageBreakBefore/>
       </w:pPr>
-      <w:bookmarkStart w:id="19" w:name="_Toc242704006"/>
+      <w:bookmarkStart w:id="19" w:name="_Toc242704455"/>
       <w:r>
         <w:lastRenderedPageBreak/>
         <w:t>9. Problemas encontrados y soluciones</w:t>
@@ -12189,7 +12255,7 @@
           <w:left w:w="10" w:type="dxa"/>
           <w:right w:w="10" w:type="dxa"/>
         </w:tblCellMar>
-        <w:tblLook w:val="04A0" w:firstRow="1" w:lastRow="0" w:firstColumn="1" w:lastColumn="0" w:noHBand="0" w:noVBand="1"/>
+        <w:tblLook w:val="0000" w:firstRow="0" w:lastRow="0" w:firstColumn="0" w:lastColumn="0" w:noHBand="0" w:noVBand="0"/>
       </w:tblPr>
       <w:tblGrid>
         <w:gridCol w:w="450"/>
@@ -16738,7 +16804,7 @@
         <w:pStyle w:val="Ttulo1"/>
         <w:pageBreakBefore/>
       </w:pPr>
-      <w:bookmarkStart w:id="20" w:name="_Toc242704007"/>
+      <w:bookmarkStart w:id="20" w:name="_Toc242704456"/>
       <w:r>
         <w:lastRenderedPageBreak/>
         <w:t>10. Cámaras</w:t>
@@ -16749,7 +16815,7 @@
       <w:pPr>
         <w:pStyle w:val="Ttulo2"/>
       </w:pPr>
-      <w:bookmarkStart w:id="21" w:name="_Toc242704008"/>
+      <w:bookmarkStart w:id="21" w:name="_Toc242704457"/>
       <w:r>
         <w:t>10.1 Descubrimiento</w:t>
       </w:r>
@@ -16855,7 +16921,7 @@
       <w:pPr>
         <w:pStyle w:val="Ttulo2"/>
       </w:pPr>
-      <w:bookmarkStart w:id="22" w:name="_Toc242704009"/>
+      <w:bookmarkStart w:id="22" w:name="_Toc242704458"/>
       <w:r>
         <w:t>10.2 Inventario</w:t>
       </w:r>
@@ -16876,7 +16942,7 @@
           <w:left w:w="10" w:type="dxa"/>
           <w:right w:w="10" w:type="dxa"/>
         </w:tblCellMar>
-        <w:tblLook w:val="04A0" w:firstRow="1" w:lastRow="0" w:firstColumn="1" w:lastColumn="0" w:noHBand="0" w:noVBand="1"/>
+        <w:tblLook w:val="0000" w:firstRow="0" w:lastRow="0" w:firstColumn="0" w:lastColumn="0" w:noHBand="0" w:noVBand="0"/>
       </w:tblPr>
       <w:tblGrid>
         <w:gridCol w:w="1805"/>
@@ -18069,7 +18135,7 @@
       <w:pPr>
         <w:pStyle w:val="Ttulo2"/>
       </w:pPr>
-      <w:bookmarkStart w:id="23" w:name="_Toc242704010"/>
+      <w:bookmarkStart w:id="23" w:name="_Toc242704459"/>
       <w:r>
         <w:t>10.3 Configuración</w:t>
       </w:r>
@@ -18952,7 +19018,7 @@
       <w:pPr>
         <w:pStyle w:val="Ttulo2"/>
       </w:pPr>
-      <w:bookmarkStart w:id="24" w:name="_Toc242704011"/>
+      <w:bookmarkStart w:id="24" w:name="_Toc242704460"/>
       <w:r>
         <w:t>10.4 Localizador de cámaras por MAC</w:t>
       </w:r>
@@ -19174,7 +19240,7 @@
           <w:left w:w="10" w:type="dxa"/>
           <w:right w:w="10" w:type="dxa"/>
         </w:tblCellMar>
-        <w:tblLook w:val="04A0" w:firstRow="1" w:lastRow="0" w:firstColumn="1" w:lastColumn="0" w:noHBand="0" w:noVBand="1"/>
+        <w:tblLook w:val="0000" w:firstRow="0" w:lastRow="0" w:firstColumn="0" w:lastColumn="0" w:noHBand="0" w:noVBand="0"/>
       </w:tblPr>
       <w:tblGrid>
         <w:gridCol w:w="2708"/>
@@ -19768,7 +19834,7 @@
           <w:left w:w="10" w:type="dxa"/>
           <w:right w:w="10" w:type="dxa"/>
         </w:tblCellMar>
-        <w:tblLook w:val="04A0" w:firstRow="1" w:lastRow="0" w:firstColumn="1" w:lastColumn="0" w:noHBand="0" w:noVBand="1"/>
+        <w:tblLook w:val="0000" w:firstRow="0" w:lastRow="0" w:firstColumn="0" w:lastColumn="0" w:noHBand="0" w:noVBand="0"/>
       </w:tblPr>
       <w:tblGrid>
         <w:gridCol w:w="3610"/>
@@ -20262,7 +20328,7 @@
       <w:pPr>
         <w:pStyle w:val="Ttulo2"/>
       </w:pPr>
-      <w:bookmarkStart w:id="25" w:name="_Toc242704012"/>
+      <w:bookmarkStart w:id="25" w:name="_Toc242704461"/>
       <w:r>
         <w:t>10.5 Cámaras iCSee nuevas (DVRIP)</w:t>
       </w:r>
@@ -20953,7 +21019,7 @@
         <w:pStyle w:val="Ttulo1"/>
         <w:pageBreakBefore/>
       </w:pPr>
-      <w:bookmarkStart w:id="26" w:name="_Toc242704013"/>
+      <w:bookmarkStart w:id="26" w:name="_Toc242704462"/>
       <w:r>
         <w:lastRenderedPageBreak/>
         <w:t>11. Acceso y puertos</w:t>
@@ -20993,7 +21059,7 @@
           <w:left w:w="10" w:type="dxa"/>
           <w:right w:w="10" w:type="dxa"/>
         </w:tblCellMar>
-        <w:tblLook w:val="04A0" w:firstRow="1" w:lastRow="0" w:firstColumn="1" w:lastColumn="0" w:noHBand="0" w:noVBand="1"/>
+        <w:tblLook w:val="0000" w:firstRow="0" w:lastRow="0" w:firstColumn="0" w:lastColumn="0" w:noHBand="0" w:noVBand="0"/>
       </w:tblPr>
       <w:tblGrid>
         <w:gridCol w:w="1235"/>
@@ -21833,7 +21899,7 @@
       <w:pPr>
         <w:pStyle w:val="Ttulo2"/>
       </w:pPr>
-      <w:bookmarkStart w:id="27" w:name="_Toc242704014"/>
+      <w:bookmarkStart w:id="27" w:name="_Toc242704463"/>
       <w:r>
         <w:t>11.1 Acceso remoto</w:t>
       </w:r>
@@ -21854,7 +21920,7 @@
           <w:left w:w="10" w:type="dxa"/>
           <w:right w:w="10" w:type="dxa"/>
         </w:tblCellMar>
-        <w:tblLook w:val="04A0" w:firstRow="1" w:lastRow="0" w:firstColumn="1" w:lastColumn="0" w:noHBand="0" w:noVBand="1"/>
+        <w:tblLook w:val="0000" w:firstRow="0" w:lastRow="0" w:firstColumn="0" w:lastColumn="0" w:noHBand="0" w:noVBand="0"/>
       </w:tblPr>
       <w:tblGrid>
         <w:gridCol w:w="3159"/>
@@ -22176,7 +22242,7 @@
         <w:pStyle w:val="Ttulo1"/>
         <w:pageBreakBefore/>
       </w:pPr>
-      <w:bookmarkStart w:id="28" w:name="_Toc242704015"/>
+      <w:bookmarkStart w:id="28" w:name="_Toc242704464"/>
       <w:r>
         <w:lastRenderedPageBreak/>
         <w:t>12. Mosaico SRT</w:t>
@@ -22237,7 +22303,7 @@
       <w:pPr>
         <w:pStyle w:val="Ttulo2"/>
       </w:pPr>
-      <w:bookmarkStart w:id="29" w:name="_Toc242704016"/>
+      <w:bookmarkStart w:id="29" w:name="_Toc242704465"/>
       <w:r>
         <w:t>12.1 Funcionamiento</w:t>
       </w:r>
@@ -22407,7 +22473,7 @@
       <w:pPr>
         <w:pStyle w:val="Ttulo2"/>
       </w:pPr>
-      <w:bookmarkStart w:id="30" w:name="_Toc242704017"/>
+      <w:bookmarkStart w:id="30" w:name="_Toc242704466"/>
       <w:r>
         <w:t>12.2 Disposición según la cantidad de cámaras</w:t>
       </w:r>
@@ -22428,7 +22494,7 @@
           <w:left w:w="10" w:type="dxa"/>
           <w:right w:w="10" w:type="dxa"/>
         </w:tblCellMar>
-        <w:tblLook w:val="04A0" w:firstRow="1" w:lastRow="0" w:firstColumn="1" w:lastColumn="0" w:noHBand="0" w:noVBand="1"/>
+        <w:tblLook w:val="0000" w:firstRow="0" w:lastRow="0" w:firstColumn="0" w:lastColumn="0" w:noHBand="0" w:noVBand="0"/>
       </w:tblPr>
       <w:tblGrid>
         <w:gridCol w:w="1805"/>
@@ -23009,7 +23075,7 @@
           <w:noProof/>
         </w:rPr>
         <w:drawing>
-          <wp:inline distT="0" distB="0" distL="0" distR="0" wp14:anchorId="111606A0" wp14:editId="1508E57F">
+          <wp:inline distT="0" distB="0" distL="0" distR="0" wp14:anchorId="6A90D5CE" wp14:editId="5167340D">
             <wp:extent cx="5715000" cy="1047750"/>
             <wp:effectExtent l="0" t="0" r="0" b="0"/>
             <wp:docPr id="2" name="Imagen 2"/>
@@ -23067,7 +23133,7 @@
       <w:pPr>
         <w:pStyle w:val="Ttulo2"/>
       </w:pPr>
-      <w:bookmarkStart w:id="31" w:name="_Toc242704018"/>
+      <w:bookmarkStart w:id="31" w:name="_Toc242704467"/>
       <w:r>
         <w:t>12.3 Configuración desde la interfaz</w:t>
       </w:r>
@@ -23088,7 +23154,7 @@
           <w:left w:w="10" w:type="dxa"/>
           <w:right w:w="10" w:type="dxa"/>
         </w:tblCellMar>
-        <w:tblLook w:val="04A0" w:firstRow="1" w:lastRow="0" w:firstColumn="1" w:lastColumn="0" w:noHBand="0" w:noVBand="1"/>
+        <w:tblLook w:val="0000" w:firstRow="0" w:lastRow="0" w:firstColumn="0" w:lastColumn="0" w:noHBand="0" w:noVBand="0"/>
       </w:tblPr>
       <w:tblGrid>
         <w:gridCol w:w="2708"/>
@@ -23849,7 +23915,7 @@
           <w:noProof/>
         </w:rPr>
         <w:drawing>
-          <wp:inline distT="0" distB="0" distL="0" distR="0" wp14:anchorId="1158E38D" wp14:editId="1A1E445C">
+          <wp:inline distT="0" distB="0" distL="0" distR="0" wp14:anchorId="7F44A5FE" wp14:editId="07A10839">
             <wp:extent cx="5334000" cy="2971800"/>
             <wp:effectExtent l="0" t="0" r="0" b="0"/>
             <wp:docPr id="3" name="Imagen 3"/>
@@ -23907,7 +23973,7 @@
       <w:pPr>
         <w:pStyle w:val="Ttulo2"/>
       </w:pPr>
-      <w:bookmarkStart w:id="32" w:name="_Toc242704019"/>
+      <w:bookmarkStart w:id="32" w:name="_Toc242704468"/>
       <w:r>
         <w:t>12.4 Cómo verlo</w:t>
       </w:r>
@@ -24018,7 +24084,7 @@
       <w:pPr>
         <w:pStyle w:val="Ttulo2"/>
       </w:pPr>
-      <w:bookmarkStart w:id="33" w:name="_Toc242704020"/>
+      <w:bookmarkStart w:id="33" w:name="_Toc242704469"/>
       <w:r>
         <w:t>12.5 Acceso desde Internet</w:t>
       </w:r>
@@ -24151,7 +24217,7 @@
       <w:pPr>
         <w:pStyle w:val="Ttulo2"/>
       </w:pPr>
-      <w:bookmarkStart w:id="34" w:name="_Toc242704021"/>
+      <w:bookmarkStart w:id="34" w:name="_Toc242704470"/>
       <w:r>
         <w:t>12.6 Validación</w:t>
       </w:r>
@@ -24172,7 +24238,7 @@
           <w:left w:w="10" w:type="dxa"/>
           <w:right w:w="10" w:type="dxa"/>
         </w:tblCellMar>
-        <w:tblLook w:val="04A0" w:firstRow="1" w:lastRow="0" w:firstColumn="1" w:lastColumn="0" w:noHBand="0" w:noVBand="1"/>
+        <w:tblLook w:val="0000" w:firstRow="0" w:lastRow="0" w:firstColumn="0" w:lastColumn="0" w:noHBand="0" w:noVBand="0"/>
       </w:tblPr>
       <w:tblGrid>
         <w:gridCol w:w="4062"/>
@@ -24699,7 +24765,7 @@
         </w:rPr>
         <w:lastRenderedPageBreak/>
         <w:drawing>
-          <wp:inline distT="0" distB="0" distL="0" distR="0" wp14:anchorId="16313060" wp14:editId="78199A21">
+          <wp:inline distT="0" distB="0" distL="0" distR="0" wp14:anchorId="47C52B6D" wp14:editId="721FE1B1">
             <wp:extent cx="4953000" cy="2781300"/>
             <wp:effectExtent l="0" t="0" r="0" b="0"/>
             <wp:docPr id="4" name="Imagen 4"/>
@@ -24757,7 +24823,7 @@
       <w:pPr>
         <w:pStyle w:val="Ttulo2"/>
       </w:pPr>
-      <w:bookmarkStart w:id="35" w:name="_Toc242704022"/>
+      <w:bookmarkStart w:id="35" w:name="_Toc242704471"/>
       <w:r>
         <w:t>12.7 Modo “Enviar a” (SRT caller)</w:t>
       </w:r>
@@ -24796,7 +24862,7 @@
           <w:left w:w="10" w:type="dxa"/>
           <w:right w:w="10" w:type="dxa"/>
         </w:tblCellMar>
-        <w:tblLook w:val="04A0" w:firstRow="1" w:lastRow="0" w:firstColumn="1" w:lastColumn="0" w:noHBand="0" w:noVBand="1"/>
+        <w:tblLook w:val="0000" w:firstRow="0" w:lastRow="0" w:firstColumn="0" w:lastColumn="0" w:noHBand="0" w:noVBand="0"/>
       </w:tblPr>
       <w:tblGrid>
         <w:gridCol w:w="2708"/>
@@ -25360,7 +25426,7 @@
       <w:pPr>
         <w:pStyle w:val="Ttulo2"/>
       </w:pPr>
-      <w:bookmarkStart w:id="36" w:name="_Toc242704023"/>
+      <w:bookmarkStart w:id="36" w:name="_Toc242704472"/>
       <w:r>
         <w:t>12.8 Diagnóstico cuando el servidor no recibe</w:t>
       </w:r>
@@ -25490,7 +25556,7 @@
       <w:pPr>
         <w:pStyle w:val="Ttulo2"/>
       </w:pPr>
-      <w:bookmarkStart w:id="37" w:name="_Toc242704024"/>
+      <w:bookmarkStart w:id="37" w:name="_Toc242704473"/>
       <w:r>
         <w:t>12.9 Estado en vivo y avisos por Telegram</w:t>
       </w:r>
@@ -25541,7 +25607,7 @@
           <w:left w:w="10" w:type="dxa"/>
           <w:right w:w="10" w:type="dxa"/>
         </w:tblCellMar>
-        <w:tblLook w:val="04A0" w:firstRow="1" w:lastRow="0" w:firstColumn="1" w:lastColumn="0" w:noHBand="0" w:noVBand="1"/>
+        <w:tblLook w:val="0000" w:firstRow="0" w:lastRow="0" w:firstColumn="0" w:lastColumn="0" w:noHBand="0" w:noVBand="0"/>
       </w:tblPr>
       <w:tblGrid>
         <w:gridCol w:w="2708"/>
@@ -25931,7 +25997,7 @@
       <w:pPr>
         <w:pStyle w:val="Ttulo2"/>
       </w:pPr>
-      <w:bookmarkStart w:id="38" w:name="_Toc242704025"/>
+      <w:bookmarkStart w:id="38" w:name="_Toc242704474"/>
       <w:r>
         <w:t>12.10 Robustez del mosaico</w:t>
       </w:r>
@@ -26133,7 +26199,7 @@
         <w:pStyle w:val="Ttulo1"/>
         <w:pageBreakBefore/>
       </w:pPr>
-      <w:bookmarkStart w:id="39" w:name="_Toc242704026"/>
+      <w:bookmarkStart w:id="39" w:name="_Toc242704475"/>
       <w:r>
         <w:lastRenderedPageBreak/>
         <w:t>13. Inteligencia artificial</w:t>
@@ -26183,7 +26249,7 @@
           <w:left w:w="10" w:type="dxa"/>
           <w:right w:w="10" w:type="dxa"/>
         </w:tblCellMar>
-        <w:tblLook w:val="04A0" w:firstRow="1" w:lastRow="0" w:firstColumn="1" w:lastColumn="0" w:noHBand="0" w:noVBand="1"/>
+        <w:tblLook w:val="0000" w:firstRow="0" w:lastRow="0" w:firstColumn="0" w:lastColumn="0" w:noHBand="0" w:noVBand="0"/>
       </w:tblPr>
       <w:tblGrid>
         <w:gridCol w:w="2076"/>
@@ -27094,7 +27160,7 @@
       <w:pPr>
         <w:pStyle w:val="Ttulo2"/>
       </w:pPr>
-      <w:bookmarkStart w:id="40" w:name="_Toc242704027"/>
+      <w:bookmarkStart w:id="40" w:name="_Toc242704476"/>
       <w:r>
         <w:t>13.1 Activar la detección</w:t>
       </w:r>
@@ -27288,7 +27354,7 @@
       <w:pPr>
         <w:pStyle w:val="Ttulo2"/>
       </w:pPr>
-      <w:bookmarkStart w:id="41" w:name="_Toc242704028"/>
+      <w:bookmarkStart w:id="41" w:name="_Toc242704477"/>
       <w:r>
         <w:t>13.2 Búsqueda semántica</w:t>
       </w:r>
@@ -27443,7 +27509,7 @@
         <w:pStyle w:val="Ttulo1"/>
         <w:pageBreakBefore/>
       </w:pPr>
-      <w:bookmarkStart w:id="42" w:name="_Toc242704029"/>
+      <w:bookmarkStart w:id="42" w:name="_Toc242704478"/>
       <w:r>
         <w:lastRenderedPageBreak/>
         <w:t>14. Software utilizado</w:t>
@@ -27465,7 +27531,7 @@
           <w:left w:w="10" w:type="dxa"/>
           <w:right w:w="10" w:type="dxa"/>
         </w:tblCellMar>
-        <w:tblLook w:val="04A0" w:firstRow="1" w:lastRow="0" w:firstColumn="1" w:lastColumn="0" w:noHBand="0" w:noVBand="1"/>
+        <w:tblLook w:val="0000" w:firstRow="0" w:lastRow="0" w:firstColumn="0" w:lastColumn="0" w:noHBand="0" w:noVBand="0"/>
       </w:tblPr>
       <w:tblGrid>
         <w:gridCol w:w="2347"/>
@@ -29814,7 +29880,7 @@
         <w:pStyle w:val="Ttulo1"/>
         <w:pageBreakBefore/>
       </w:pPr>
-      <w:bookmarkStart w:id="43" w:name="_Toc242704030"/>
+      <w:bookmarkStart w:id="43" w:name="_Toc242704479"/>
       <w:r>
         <w:lastRenderedPageBreak/>
         <w:t>15. Operación diaria</w:t>
@@ -29836,7 +29902,7 @@
           <w:left w:w="10" w:type="dxa"/>
           <w:right w:w="10" w:type="dxa"/>
         </w:tblCellMar>
-        <w:tblLook w:val="04A0" w:firstRow="1" w:lastRow="0" w:firstColumn="1" w:lastColumn="0" w:noHBand="0" w:noVBand="1"/>
+        <w:tblLook w:val="0000" w:firstRow="0" w:lastRow="0" w:firstColumn="0" w:lastColumn="0" w:noHBand="0" w:noVBand="0"/>
       </w:tblPr>
       <w:tblGrid>
         <w:gridCol w:w="2708"/>
@@ -30456,7 +30522,7 @@
       <w:pPr>
         <w:pStyle w:val="Ttulo2"/>
       </w:pPr>
-      <w:bookmarkStart w:id="44" w:name="_Toc242704031"/>
+      <w:bookmarkStart w:id="44" w:name="_Toc242704480"/>
       <w:r>
         <w:t>15.1 Editar la configuración (siempre con respaldo)</w:t>
       </w:r>
@@ -30597,7 +30663,7 @@
       <w:pPr>
         <w:pStyle w:val="Ttulo2"/>
       </w:pPr>
-      <w:bookmarkStart w:id="45" w:name="_Toc242704032"/>
+      <w:bookmarkStart w:id="45" w:name="_Toc242704481"/>
       <w:r>
         <w:t>15.2 Vigilancia en Proxmox (en el nodo)</w:t>
       </w:r>
@@ -30668,7 +30734,7 @@
         <w:pStyle w:val="Ttulo1"/>
         <w:pageBreakBefore/>
       </w:pPr>
-      <w:bookmarkStart w:id="46" w:name="_Toc242704033"/>
+      <w:bookmarkStart w:id="46" w:name="_Toc242704482"/>
       <w:r>
         <w:lastRenderedPageBreak/>
         <w:t>16. Pendientes y próximos pasos</w:t>
@@ -30690,7 +30756,7 @@
           <w:left w:w="10" w:type="dxa"/>
           <w:right w:w="10" w:type="dxa"/>
         </w:tblCellMar>
-        <w:tblLook w:val="04A0" w:firstRow="1" w:lastRow="0" w:firstColumn="1" w:lastColumn="0" w:noHBand="0" w:noVBand="1"/>
+        <w:tblLook w:val="0000" w:firstRow="0" w:lastRow="0" w:firstColumn="0" w:lastColumn="0" w:noHBand="0" w:noVBand="0"/>
       </w:tblPr>
       <w:tblGrid>
         <w:gridCol w:w="542"/>
@@ -32534,7 +32600,7 @@
         <w:pStyle w:val="Ttulo1"/>
         <w:pageBreakBefore/>
       </w:pPr>
-      <w:bookmarkStart w:id="47" w:name="_Toc242704034"/>
+      <w:bookmarkStart w:id="47" w:name="_Toc242704483"/>
       <w:r>
         <w:lastRenderedPageBreak/>
         <w:t>17. Mejoras propuestas para la plataforma Orbitv</w:t>
@@ -32563,7 +32629,7 @@
       <w:pPr>
         <w:pStyle w:val="Ttulo2"/>
       </w:pPr>
-      <w:bookmarkStart w:id="48" w:name="_Toc242704035"/>
+      <w:bookmarkStart w:id="48" w:name="_Toc242704484"/>
       <w:r>
         <w:t>17.1 srt-mux: sesión “conectada” sin entregar datos</w:t>
       </w:r>
@@ -32599,7 +32665,7 @@
           <w:left w:w="10" w:type="dxa"/>
           <w:right w:w="10" w:type="dxa"/>
         </w:tblCellMar>
-        <w:tblLook w:val="04A0" w:firstRow="1" w:lastRow="0" w:firstColumn="1" w:lastColumn="0" w:noHBand="0" w:noVBand="1"/>
+        <w:tblLook w:val="0000" w:firstRow="0" w:lastRow="0" w:firstColumn="0" w:lastColumn="0" w:noHBand="0" w:noVBand="0"/>
       </w:tblPr>
       <w:tblGrid>
         <w:gridCol w:w="1805"/>
@@ -33203,7 +33269,7 @@
       <w:pPr>
         <w:pStyle w:val="Ttulo2"/>
       </w:pPr>
-      <w:bookmarkStart w:id="49" w:name="_Toc242704036"/>
+      <w:bookmarkStart w:id="49" w:name="_Toc242704485"/>
       <w:r>
         <w:t>17.2 OrbiTx: transcodificador vivo pero sin producir video</w:t>
       </w:r>
@@ -33340,7 +33406,7 @@
       <w:pPr>
         <w:pStyle w:val="Ttulo2"/>
       </w:pPr>
-      <w:bookmarkStart w:id="50" w:name="_Toc242704037"/>
+      <w:bookmarkStart w:id="50" w:name="_Toc242704486"/>
       <w:r>
         <w:t>17.3 Pérdida de paquetes desde Temuco</w:t>
       </w:r>
@@ -33361,7 +33427,7 @@
           <w:left w:w="10" w:type="dxa"/>
           <w:right w:w="10" w:type="dxa"/>
         </w:tblCellMar>
-        <w:tblLook w:val="04A0" w:firstRow="1" w:lastRow="0" w:firstColumn="1" w:lastColumn="0" w:noHBand="0" w:noVBand="1"/>
+        <w:tblLook w:val="0000" w:firstRow="0" w:lastRow="0" w:firstColumn="0" w:lastColumn="0" w:noHBand="0" w:noVBand="0"/>
       </w:tblPr>
       <w:tblGrid>
         <w:gridCol w:w="4062"/>
@@ -33755,7 +33821,7 @@
         <w:pStyle w:val="Ttulo1"/>
         <w:pageBreakBefore/>
       </w:pPr>
-      <w:bookmarkStart w:id="51" w:name="_Toc242704038"/>
+      <w:bookmarkStart w:id="51" w:name="_Toc242704487"/>
       <w:r>
         <w:lastRenderedPageBreak/>
         <w:t>18. Dimensionamiento de hardware</w:t>
@@ -33795,7 +33861,7 @@
           <w:left w:w="10" w:type="dxa"/>
           <w:right w:w="10" w:type="dxa"/>
         </w:tblCellMar>
-        <w:tblLook w:val="04A0" w:firstRow="1" w:lastRow="0" w:firstColumn="1" w:lastColumn="0" w:noHBand="0" w:noVBand="1"/>
+        <w:tblLook w:val="0000" w:firstRow="0" w:lastRow="0" w:firstColumn="0" w:lastColumn="0" w:noHBand="0" w:noVBand="0"/>
       </w:tblPr>
       <w:tblGrid>
         <w:gridCol w:w="2708"/>
@@ -34192,7 +34258,7 @@
       <w:pPr>
         <w:pStyle w:val="Ttulo2"/>
       </w:pPr>
-      <w:bookmarkStart w:id="52" w:name="_Toc242704039"/>
+      <w:bookmarkStart w:id="52" w:name="_Toc242704488"/>
       <w:r>
         <w:t>18.1 Escenarios</w:t>
       </w:r>
@@ -34213,7 +34279,7 @@
           <w:left w:w="10" w:type="dxa"/>
           <w:right w:w="10" w:type="dxa"/>
         </w:tblCellMar>
-        <w:tblLook w:val="04A0" w:firstRow="1" w:lastRow="0" w:firstColumn="1" w:lastColumn="0" w:noHBand="0" w:noVBand="1"/>
+        <w:tblLook w:val="0000" w:firstRow="0" w:lastRow="0" w:firstColumn="0" w:lastColumn="0" w:noHBand="0" w:noVBand="0"/>
       </w:tblPr>
       <w:tblGrid>
         <w:gridCol w:w="1986"/>
@@ -34730,7 +34796,7 @@
                 <w:sz w:val="19"/>
                 <w:szCs w:val="19"/>
               </w:rPr>
-              <w:t>Disco</w:t>
+              <w:t>Disco (7 días)</w:t>
             </w:r>
           </w:p>
         </w:tc>
@@ -34754,10 +34820,19 @@
           <w:p>
             <w:r>
               <w:rPr>
-                <w:sz w:val="19"/>
-                <w:szCs w:val="19"/>
-              </w:rPr>
-              <w:t>512 GB NVMe único (7 días por movimiento ≈ 180 GB)</w:t>
+                <w:b/>
+                <w:bCs/>
+                <w:sz w:val="19"/>
+                <w:szCs w:val="19"/>
+              </w:rPr>
+              <w:t>512 GB NVMe único</w:t>
+            </w:r>
+            <w:r>
+              <w:rPr>
+                <w:sz w:val="19"/>
+                <w:szCs w:val="19"/>
+              </w:rPr>
+              <w:t>: solo alertas IA ≈ 12 GB; por movimiento ≈ 30 GB. Continuo: 1 TB</w:t>
             </w:r>
           </w:p>
         </w:tc>
@@ -34781,10 +34856,19 @@
           <w:p>
             <w:r>
               <w:rPr>
-                <w:sz w:val="19"/>
-                <w:szCs w:val="19"/>
-              </w:rPr>
-              <w:t>NVMe 512 GB + 2 TB para grabaciones</w:t>
+                <w:b/>
+                <w:bCs/>
+                <w:sz w:val="19"/>
+                <w:szCs w:val="19"/>
+              </w:rPr>
+              <w:t>512 GB NVMe único</w:t>
+            </w:r>
+            <w:r>
+              <w:rPr>
+                <w:sz w:val="19"/>
+                <w:szCs w:val="19"/>
+              </w:rPr>
+              <w:t>: solo alertas IA ≈ 24 GB; por movimiento ≈ 60 GB. Continuo: + 2 TB</w:t>
             </w:r>
           </w:p>
         </w:tc>
@@ -35051,7 +35135,7 @@
                 <w:sz w:val="19"/>
                 <w:szCs w:val="19"/>
               </w:rPr>
-              <w:t>CLP 450.000 – 650.000 estimado + disco 2 TB</w:t>
+              <w:t>CLP 450.000 – 650.000 estimado (+ disco 2 TB solo para grabación continua)</w:t>
             </w:r>
           </w:p>
         </w:tc>
@@ -35155,7 +35239,7 @@
       <w:pPr>
         <w:pStyle w:val="Ttulo2"/>
       </w:pPr>
-      <w:bookmarkStart w:id="53" w:name="_Toc242704040"/>
+      <w:bookmarkStart w:id="53" w:name="_Toc242704489"/>
       <w:r>
         <w:t>18.2 Criterios</w:t>
       </w:r>
@@ -35235,40 +35319,20 @@
           <w:b/>
           <w:bCs/>
         </w:rPr>
+        <w:lastRenderedPageBreak/>
         <w:t>Disco:</w:t>
       </w:r>
       <w:r>
         <w:t xml:space="preserve"> GB = cámaras × Mbit/s × 86.400 ÷ 8 ÷ 1000 × días × % del día grabado (hoja “Calculadora disco” del Excel de KPIs).</w:t>
-      </w:r>
-    </w:p>
-    <w:p>
-      <w:pPr>
-        <w:pStyle w:val="Prrafodelista"/>
-        <w:numPr>
-          <w:ilvl w:val="0"/>
-          <w:numId w:val="2"/>
-        </w:numPr>
-        <w:spacing w:after="60"/>
-      </w:pPr>
-      <w:r>
-        <w:rPr>
-          <w:b/>
-          <w:bCs/>
-        </w:rPr>
-        <w:lastRenderedPageBreak/>
-        <w:t>Cámaras iCSee nuevas (DVRIP):</w:t>
-      </w:r>
-      <w:r>
-        <w:t xml:space="preserve"> grabarlas sin audio (10.5) vale para cualquier equipo.</w:t>
       </w:r>
     </w:p>
     <w:p>
       <w:pPr>
         <w:pStyle w:val="Ttulo2"/>
       </w:pPr>
-      <w:bookmarkStart w:id="54" w:name="_Toc242704041"/>
-      <w:r>
-        <w:t>18.3 Modelos de referencia</w:t>
+      <w:bookmarkStart w:id="54" w:name="_Toc242704490"/>
+      <w:r>
+        <w:t>18.4 Disco según el modo de grabación</w:t>
       </w:r>
       <w:bookmarkEnd w:id="54"/>
     </w:p>
@@ -35277,7 +35341,37 @@
         <w:spacing w:after="120" w:line="276" w:lineRule="auto"/>
       </w:pPr>
       <w:r>
-        <w:t>Precios vistos el 12/10/2026; cambian a diario y deben verificarse al comprar, incluyendo IVA, envío y garantía local.</w:t>
+        <w:t xml:space="preserve">Se recomienda guardar </w:t>
+      </w:r>
+      <w:r>
+        <w:rPr>
+          <w:b/>
+          <w:bCs/>
+        </w:rPr>
+        <w:t>7 días solo de las alertas de IA</w:t>
+      </w:r>
+      <w:r>
+        <w:t xml:space="preserve"> (personas, autos, intrusos) con 5 s antes y después de cada una. Medido en el laboratorio durante 7 días: las alertas ocupan </w:t>
+      </w:r>
+      <w:r>
+        <w:rPr>
+          <w:b/>
+          <w:bCs/>
+        </w:rPr>
+        <w:t>0,2–0,3 % del día</w:t>
+      </w:r>
+      <w:r>
+        <w:t xml:space="preserve"> por cámara y la grabación por movimiento </w:t>
+      </w:r>
+      <w:r>
+        <w:rPr>
+          <w:b/>
+          <w:bCs/>
+        </w:rPr>
+        <w:t>0,3–1,6 GB por día</w:t>
+      </w:r>
+      <w:r>
+        <w:t xml:space="preserve"> por cámara. Con margen (2 % y 5 % del día) para sitios con más tránsito:</w:t>
       </w:r>
     </w:p>
     <w:tbl>
@@ -35295,7 +35389,842 @@
           <w:left w:w="10" w:type="dxa"/>
           <w:right w:w="10" w:type="dxa"/>
         </w:tblCellMar>
-        <w:tblLook w:val="04A0" w:firstRow="1" w:lastRow="0" w:firstColumn="1" w:lastColumn="0" w:noHBand="0" w:noVBand="1"/>
+        <w:tblLook w:val="0000" w:firstRow="0" w:lastRow="0" w:firstColumn="0" w:lastColumn="0" w:noHBand="0" w:noVBand="0"/>
+      </w:tblPr>
+      <w:tblGrid>
+        <w:gridCol w:w="2257"/>
+        <w:gridCol w:w="2257"/>
+        <w:gridCol w:w="2257"/>
+        <w:gridCol w:w="2255"/>
+      </w:tblGrid>
+      <w:tr>
+        <w:tblPrEx>
+          <w:tblCellMar>
+            <w:top w:w="0" w:type="dxa"/>
+            <w:bottom w:w="0" w:type="dxa"/>
+          </w:tblCellMar>
+        </w:tblPrEx>
+        <w:trPr>
+          <w:tblHeader/>
+        </w:trPr>
+        <w:tc>
+          <w:tcPr>
+            <w:tcW w:w="2257" w:type="dxa"/>
+            <w:tcBorders>
+              <w:top w:val="single" w:sz="4" w:space="0" w:color="BFBFBF"/>
+              <w:left w:val="single" w:sz="4" w:space="0" w:color="BFBFBF"/>
+              <w:bottom w:val="single" w:sz="4" w:space="0" w:color="BFBFBF"/>
+              <w:right w:val="single" w:sz="4" w:space="0" w:color="BFBFBF"/>
+            </w:tcBorders>
+            <w:shd w:val="clear" w:color="auto" w:fill="1F4E79"/>
+            <w:tcMar>
+              <w:top w:w="60" w:type="dxa"/>
+              <w:left w:w="100" w:type="dxa"/>
+              <w:bottom w:w="60" w:type="dxa"/>
+              <w:right w:w="100" w:type="dxa"/>
+            </w:tcMar>
+          </w:tcPr>
+          <w:p>
+            <w:r>
+              <w:rPr>
+                <w:b/>
+                <w:bCs/>
+                <w:color w:val="FFFFFF"/>
+                <w:sz w:val="19"/>
+                <w:szCs w:val="19"/>
+              </w:rPr>
+              <w:t>Escenario</w:t>
+            </w:r>
+          </w:p>
+        </w:tc>
+        <w:tc>
+          <w:tcPr>
+            <w:tcW w:w="2257" w:type="dxa"/>
+            <w:tcBorders>
+              <w:top w:val="single" w:sz="4" w:space="0" w:color="BFBFBF"/>
+              <w:left w:val="single" w:sz="4" w:space="0" w:color="BFBFBF"/>
+              <w:bottom w:val="single" w:sz="4" w:space="0" w:color="BFBFBF"/>
+              <w:right w:val="single" w:sz="4" w:space="0" w:color="BFBFBF"/>
+            </w:tcBorders>
+            <w:shd w:val="clear" w:color="auto" w:fill="1F4E79"/>
+            <w:tcMar>
+              <w:top w:w="60" w:type="dxa"/>
+              <w:left w:w="100" w:type="dxa"/>
+              <w:bottom w:w="60" w:type="dxa"/>
+              <w:right w:w="100" w:type="dxa"/>
+            </w:tcMar>
+          </w:tcPr>
+          <w:p>
+            <w:r>
+              <w:rPr>
+                <w:b/>
+                <w:bCs/>
+                <w:color w:val="FFFFFF"/>
+                <w:sz w:val="19"/>
+                <w:szCs w:val="19"/>
+              </w:rPr>
+              <w:t>A. Solo alertas IA</w:t>
+            </w:r>
+          </w:p>
+        </w:tc>
+        <w:tc>
+          <w:tcPr>
+            <w:tcW w:w="2257" w:type="dxa"/>
+            <w:tcBorders>
+              <w:top w:val="single" w:sz="4" w:space="0" w:color="BFBFBF"/>
+              <w:left w:val="single" w:sz="4" w:space="0" w:color="BFBFBF"/>
+              <w:bottom w:val="single" w:sz="4" w:space="0" w:color="BFBFBF"/>
+              <w:right w:val="single" w:sz="4" w:space="0" w:color="BFBFBF"/>
+            </w:tcBorders>
+            <w:shd w:val="clear" w:color="auto" w:fill="1F4E79"/>
+            <w:tcMar>
+              <w:top w:w="60" w:type="dxa"/>
+              <w:left w:w="100" w:type="dxa"/>
+              <w:bottom w:w="60" w:type="dxa"/>
+              <w:right w:w="100" w:type="dxa"/>
+            </w:tcMar>
+          </w:tcPr>
+          <w:p>
+            <w:r>
+              <w:rPr>
+                <w:b/>
+                <w:bCs/>
+                <w:color w:val="FFFFFF"/>
+                <w:sz w:val="19"/>
+                <w:szCs w:val="19"/>
+              </w:rPr>
+              <w:t>B. Por movimiento</w:t>
+            </w:r>
+          </w:p>
+        </w:tc>
+        <w:tc>
+          <w:tcPr>
+            <w:tcW w:w="2255" w:type="dxa"/>
+            <w:tcBorders>
+              <w:top w:val="single" w:sz="4" w:space="0" w:color="BFBFBF"/>
+              <w:left w:val="single" w:sz="4" w:space="0" w:color="BFBFBF"/>
+              <w:bottom w:val="single" w:sz="4" w:space="0" w:color="BFBFBF"/>
+              <w:right w:val="single" w:sz="4" w:space="0" w:color="BFBFBF"/>
+            </w:tcBorders>
+            <w:shd w:val="clear" w:color="auto" w:fill="1F4E79"/>
+            <w:tcMar>
+              <w:top w:w="60" w:type="dxa"/>
+              <w:left w:w="100" w:type="dxa"/>
+              <w:bottom w:w="60" w:type="dxa"/>
+              <w:right w:w="100" w:type="dxa"/>
+            </w:tcMar>
+          </w:tcPr>
+          <w:p>
+            <w:r>
+              <w:rPr>
+                <w:b/>
+                <w:bCs/>
+                <w:color w:val="FFFFFF"/>
+                <w:sz w:val="19"/>
+                <w:szCs w:val="19"/>
+              </w:rPr>
+              <w:t>C. Continuo</w:t>
+            </w:r>
+          </w:p>
+        </w:tc>
+      </w:tr>
+      <w:tr>
+        <w:tblPrEx>
+          <w:tblCellMar>
+            <w:top w:w="0" w:type="dxa"/>
+            <w:bottom w:w="0" w:type="dxa"/>
+          </w:tblCellMar>
+        </w:tblPrEx>
+        <w:tc>
+          <w:tcPr>
+            <w:tcW w:w="2257" w:type="dxa"/>
+            <w:tcBorders>
+              <w:top w:val="single" w:sz="4" w:space="0" w:color="BFBFBF"/>
+              <w:left w:val="single" w:sz="4" w:space="0" w:color="BFBFBF"/>
+              <w:bottom w:val="single" w:sz="4" w:space="0" w:color="BFBFBF"/>
+              <w:right w:val="single" w:sz="4" w:space="0" w:color="BFBFBF"/>
+            </w:tcBorders>
+            <w:shd w:val="clear" w:color="auto" w:fill="FFFFFF"/>
+            <w:tcMar>
+              <w:top w:w="60" w:type="dxa"/>
+              <w:left w:w="100" w:type="dxa"/>
+              <w:bottom w:w="60" w:type="dxa"/>
+              <w:right w:w="100" w:type="dxa"/>
+            </w:tcMar>
+          </w:tcPr>
+          <w:p>
+            <w:r>
+              <w:rPr>
+                <w:sz w:val="19"/>
+                <w:szCs w:val="19"/>
+              </w:rPr>
+              <w:t>1 · 4 cámaras</w:t>
+            </w:r>
+          </w:p>
+        </w:tc>
+        <w:tc>
+          <w:tcPr>
+            <w:tcW w:w="2257" w:type="dxa"/>
+            <w:tcBorders>
+              <w:top w:val="single" w:sz="4" w:space="0" w:color="BFBFBF"/>
+              <w:left w:val="single" w:sz="4" w:space="0" w:color="BFBFBF"/>
+              <w:bottom w:val="single" w:sz="4" w:space="0" w:color="BFBFBF"/>
+              <w:right w:val="single" w:sz="4" w:space="0" w:color="BFBFBF"/>
+            </w:tcBorders>
+            <w:shd w:val="clear" w:color="auto" w:fill="FFFFFF"/>
+            <w:tcMar>
+              <w:top w:w="60" w:type="dxa"/>
+              <w:left w:w="100" w:type="dxa"/>
+              <w:bottom w:w="60" w:type="dxa"/>
+              <w:right w:w="100" w:type="dxa"/>
+            </w:tcMar>
+          </w:tcPr>
+          <w:p>
+            <w:r>
+              <w:rPr>
+                <w:sz w:val="19"/>
+                <w:szCs w:val="19"/>
+              </w:rPr>
+              <w:t>≈ 12 GB</w:t>
+            </w:r>
+          </w:p>
+        </w:tc>
+        <w:tc>
+          <w:tcPr>
+            <w:tcW w:w="2257" w:type="dxa"/>
+            <w:tcBorders>
+              <w:top w:val="single" w:sz="4" w:space="0" w:color="BFBFBF"/>
+              <w:left w:val="single" w:sz="4" w:space="0" w:color="BFBFBF"/>
+              <w:bottom w:val="single" w:sz="4" w:space="0" w:color="BFBFBF"/>
+              <w:right w:val="single" w:sz="4" w:space="0" w:color="BFBFBF"/>
+            </w:tcBorders>
+            <w:shd w:val="clear" w:color="auto" w:fill="FFFFFF"/>
+            <w:tcMar>
+              <w:top w:w="60" w:type="dxa"/>
+              <w:left w:w="100" w:type="dxa"/>
+              <w:bottom w:w="60" w:type="dxa"/>
+              <w:right w:w="100" w:type="dxa"/>
+            </w:tcMar>
+          </w:tcPr>
+          <w:p>
+            <w:r>
+              <w:rPr>
+                <w:sz w:val="19"/>
+                <w:szCs w:val="19"/>
+              </w:rPr>
+              <w:t>≈ 30 GB</w:t>
+            </w:r>
+          </w:p>
+        </w:tc>
+        <w:tc>
+          <w:tcPr>
+            <w:tcW w:w="2255" w:type="dxa"/>
+            <w:tcBorders>
+              <w:top w:val="single" w:sz="4" w:space="0" w:color="BFBFBF"/>
+              <w:left w:val="single" w:sz="4" w:space="0" w:color="BFBFBF"/>
+              <w:bottom w:val="single" w:sz="4" w:space="0" w:color="BFBFBF"/>
+              <w:right w:val="single" w:sz="4" w:space="0" w:color="BFBFBF"/>
+            </w:tcBorders>
+            <w:shd w:val="clear" w:color="auto" w:fill="FFFFFF"/>
+            <w:tcMar>
+              <w:top w:w="60" w:type="dxa"/>
+              <w:left w:w="100" w:type="dxa"/>
+              <w:bottom w:w="60" w:type="dxa"/>
+              <w:right w:w="100" w:type="dxa"/>
+            </w:tcMar>
+          </w:tcPr>
+          <w:p>
+            <w:r>
+              <w:rPr>
+                <w:sz w:val="19"/>
+                <w:szCs w:val="19"/>
+              </w:rPr>
+              <w:t>≈ 600 GB</w:t>
+            </w:r>
+          </w:p>
+        </w:tc>
+      </w:tr>
+      <w:tr>
+        <w:tblPrEx>
+          <w:tblCellMar>
+            <w:top w:w="0" w:type="dxa"/>
+            <w:bottom w:w="0" w:type="dxa"/>
+          </w:tblCellMar>
+        </w:tblPrEx>
+        <w:tc>
+          <w:tcPr>
+            <w:tcW w:w="2257" w:type="dxa"/>
+            <w:tcBorders>
+              <w:top w:val="single" w:sz="4" w:space="0" w:color="BFBFBF"/>
+              <w:left w:val="single" w:sz="4" w:space="0" w:color="BFBFBF"/>
+              <w:bottom w:val="single" w:sz="4" w:space="0" w:color="BFBFBF"/>
+              <w:right w:val="single" w:sz="4" w:space="0" w:color="BFBFBF"/>
+            </w:tcBorders>
+            <w:shd w:val="clear" w:color="auto" w:fill="EEF3F8"/>
+            <w:tcMar>
+              <w:top w:w="60" w:type="dxa"/>
+              <w:left w:w="100" w:type="dxa"/>
+              <w:bottom w:w="60" w:type="dxa"/>
+              <w:right w:w="100" w:type="dxa"/>
+            </w:tcMar>
+          </w:tcPr>
+          <w:p>
+            <w:r>
+              <w:rPr>
+                <w:sz w:val="19"/>
+                <w:szCs w:val="19"/>
+              </w:rPr>
+              <w:t>2 · 8 cámaras</w:t>
+            </w:r>
+          </w:p>
+        </w:tc>
+        <w:tc>
+          <w:tcPr>
+            <w:tcW w:w="2257" w:type="dxa"/>
+            <w:tcBorders>
+              <w:top w:val="single" w:sz="4" w:space="0" w:color="BFBFBF"/>
+              <w:left w:val="single" w:sz="4" w:space="0" w:color="BFBFBF"/>
+              <w:bottom w:val="single" w:sz="4" w:space="0" w:color="BFBFBF"/>
+              <w:right w:val="single" w:sz="4" w:space="0" w:color="BFBFBF"/>
+            </w:tcBorders>
+            <w:shd w:val="clear" w:color="auto" w:fill="EEF3F8"/>
+            <w:tcMar>
+              <w:top w:w="60" w:type="dxa"/>
+              <w:left w:w="100" w:type="dxa"/>
+              <w:bottom w:w="60" w:type="dxa"/>
+              <w:right w:w="100" w:type="dxa"/>
+            </w:tcMar>
+          </w:tcPr>
+          <w:p>
+            <w:r>
+              <w:rPr>
+                <w:sz w:val="19"/>
+                <w:szCs w:val="19"/>
+              </w:rPr>
+              <w:t>≈ 24 GB</w:t>
+            </w:r>
+          </w:p>
+        </w:tc>
+        <w:tc>
+          <w:tcPr>
+            <w:tcW w:w="2257" w:type="dxa"/>
+            <w:tcBorders>
+              <w:top w:val="single" w:sz="4" w:space="0" w:color="BFBFBF"/>
+              <w:left w:val="single" w:sz="4" w:space="0" w:color="BFBFBF"/>
+              <w:bottom w:val="single" w:sz="4" w:space="0" w:color="BFBFBF"/>
+              <w:right w:val="single" w:sz="4" w:space="0" w:color="BFBFBF"/>
+            </w:tcBorders>
+            <w:shd w:val="clear" w:color="auto" w:fill="EEF3F8"/>
+            <w:tcMar>
+              <w:top w:w="60" w:type="dxa"/>
+              <w:left w:w="100" w:type="dxa"/>
+              <w:bottom w:w="60" w:type="dxa"/>
+              <w:right w:w="100" w:type="dxa"/>
+            </w:tcMar>
+          </w:tcPr>
+          <w:p>
+            <w:r>
+              <w:rPr>
+                <w:sz w:val="19"/>
+                <w:szCs w:val="19"/>
+              </w:rPr>
+              <w:t>≈ 60 GB</w:t>
+            </w:r>
+          </w:p>
+        </w:tc>
+        <w:tc>
+          <w:tcPr>
+            <w:tcW w:w="2255" w:type="dxa"/>
+            <w:tcBorders>
+              <w:top w:val="single" w:sz="4" w:space="0" w:color="BFBFBF"/>
+              <w:left w:val="single" w:sz="4" w:space="0" w:color="BFBFBF"/>
+              <w:bottom w:val="single" w:sz="4" w:space="0" w:color="BFBFBF"/>
+              <w:right w:val="single" w:sz="4" w:space="0" w:color="BFBFBF"/>
+            </w:tcBorders>
+            <w:shd w:val="clear" w:color="auto" w:fill="EEF3F8"/>
+            <w:tcMar>
+              <w:top w:w="60" w:type="dxa"/>
+              <w:left w:w="100" w:type="dxa"/>
+              <w:bottom w:w="60" w:type="dxa"/>
+              <w:right w:w="100" w:type="dxa"/>
+            </w:tcMar>
+          </w:tcPr>
+          <w:p>
+            <w:r>
+              <w:rPr>
+                <w:sz w:val="19"/>
+                <w:szCs w:val="19"/>
+              </w:rPr>
+              <w:t>≈ 1,2 TB</w:t>
+            </w:r>
+          </w:p>
+        </w:tc>
+      </w:tr>
+      <w:tr>
+        <w:tblPrEx>
+          <w:tblCellMar>
+            <w:top w:w="0" w:type="dxa"/>
+            <w:bottom w:w="0" w:type="dxa"/>
+          </w:tblCellMar>
+        </w:tblPrEx>
+        <w:tc>
+          <w:tcPr>
+            <w:tcW w:w="2257" w:type="dxa"/>
+            <w:tcBorders>
+              <w:top w:val="single" w:sz="4" w:space="0" w:color="BFBFBF"/>
+              <w:left w:val="single" w:sz="4" w:space="0" w:color="BFBFBF"/>
+              <w:bottom w:val="single" w:sz="4" w:space="0" w:color="BFBFBF"/>
+              <w:right w:val="single" w:sz="4" w:space="0" w:color="BFBFBF"/>
+            </w:tcBorders>
+            <w:shd w:val="clear" w:color="auto" w:fill="FFFFFF"/>
+            <w:tcMar>
+              <w:top w:w="60" w:type="dxa"/>
+              <w:left w:w="100" w:type="dxa"/>
+              <w:bottom w:w="60" w:type="dxa"/>
+              <w:right w:w="100" w:type="dxa"/>
+            </w:tcMar>
+          </w:tcPr>
+          <w:p>
+            <w:r>
+              <w:rPr>
+                <w:sz w:val="19"/>
+                <w:szCs w:val="19"/>
+              </w:rPr>
+              <w:t>Disco</w:t>
+            </w:r>
+          </w:p>
+        </w:tc>
+        <w:tc>
+          <w:tcPr>
+            <w:tcW w:w="2257" w:type="dxa"/>
+            <w:tcBorders>
+              <w:top w:val="single" w:sz="4" w:space="0" w:color="BFBFBF"/>
+              <w:left w:val="single" w:sz="4" w:space="0" w:color="BFBFBF"/>
+              <w:bottom w:val="single" w:sz="4" w:space="0" w:color="BFBFBF"/>
+              <w:right w:val="single" w:sz="4" w:space="0" w:color="BFBFBF"/>
+            </w:tcBorders>
+            <w:shd w:val="clear" w:color="auto" w:fill="FFFFFF"/>
+            <w:tcMar>
+              <w:top w:w="60" w:type="dxa"/>
+              <w:left w:w="100" w:type="dxa"/>
+              <w:bottom w:w="60" w:type="dxa"/>
+              <w:right w:w="100" w:type="dxa"/>
+            </w:tcMar>
+          </w:tcPr>
+          <w:p>
+            <w:r>
+              <w:rPr>
+                <w:sz w:val="19"/>
+                <w:szCs w:val="19"/>
+              </w:rPr>
+              <w:t>512 GB (incluido)</w:t>
+            </w:r>
+          </w:p>
+        </w:tc>
+        <w:tc>
+          <w:tcPr>
+            <w:tcW w:w="2257" w:type="dxa"/>
+            <w:tcBorders>
+              <w:top w:val="single" w:sz="4" w:space="0" w:color="BFBFBF"/>
+              <w:left w:val="single" w:sz="4" w:space="0" w:color="BFBFBF"/>
+              <w:bottom w:val="single" w:sz="4" w:space="0" w:color="BFBFBF"/>
+              <w:right w:val="single" w:sz="4" w:space="0" w:color="BFBFBF"/>
+            </w:tcBorders>
+            <w:shd w:val="clear" w:color="auto" w:fill="FFFFFF"/>
+            <w:tcMar>
+              <w:top w:w="60" w:type="dxa"/>
+              <w:left w:w="100" w:type="dxa"/>
+              <w:bottom w:w="60" w:type="dxa"/>
+              <w:right w:w="100" w:type="dxa"/>
+            </w:tcMar>
+          </w:tcPr>
+          <w:p>
+            <w:r>
+              <w:rPr>
+                <w:sz w:val="19"/>
+                <w:szCs w:val="19"/>
+              </w:rPr>
+              <w:t>512 GB (incluido)</w:t>
+            </w:r>
+          </w:p>
+        </w:tc>
+        <w:tc>
+          <w:tcPr>
+            <w:tcW w:w="2255" w:type="dxa"/>
+            <w:tcBorders>
+              <w:top w:val="single" w:sz="4" w:space="0" w:color="BFBFBF"/>
+              <w:left w:val="single" w:sz="4" w:space="0" w:color="BFBFBF"/>
+              <w:bottom w:val="single" w:sz="4" w:space="0" w:color="BFBFBF"/>
+              <w:right w:val="single" w:sz="4" w:space="0" w:color="BFBFBF"/>
+            </w:tcBorders>
+            <w:shd w:val="clear" w:color="auto" w:fill="FFFFFF"/>
+            <w:tcMar>
+              <w:top w:w="60" w:type="dxa"/>
+              <w:left w:w="100" w:type="dxa"/>
+              <w:bottom w:w="60" w:type="dxa"/>
+              <w:right w:w="100" w:type="dxa"/>
+            </w:tcMar>
+          </w:tcPr>
+          <w:p>
+            <w:r>
+              <w:rPr>
+                <w:sz w:val="19"/>
+                <w:szCs w:val="19"/>
+              </w:rPr>
+              <w:t>1 TB / 2 TB adicional</w:t>
+            </w:r>
+          </w:p>
+        </w:tc>
+      </w:tr>
+    </w:tbl>
+    <w:p>
+      <w:pPr>
+        <w:spacing w:after="80"/>
+      </w:pPr>
+    </w:p>
+    <w:p>
+      <w:pPr>
+        <w:spacing w:after="120" w:line="276" w:lineRule="auto"/>
+      </w:pPr>
+      <w:r>
+        <w:t xml:space="preserve">Configuración del modo A en </w:t>
+      </w:r>
+      <w:r>
+        <w:rPr>
+          <w:rFonts w:ascii="Consolas" w:eastAsia="Consolas" w:hAnsi="Consolas" w:cs="Consolas"/>
+          <w:color w:val="7A1F1F"/>
+          <w:sz w:val="19"/>
+          <w:szCs w:val="19"/>
+        </w:rPr>
+        <w:t>config.yml</w:t>
+      </w:r>
+      <w:r>
+        <w:t>:</w:t>
+      </w:r>
+    </w:p>
+    <w:p>
+      <w:pPr>
+        <w:pBdr>
+          <w:top w:val="single" w:sz="4" w:space="4" w:color="BFBFBF"/>
+          <w:left w:val="single" w:sz="4" w:space="4" w:color="BFBFBF"/>
+          <w:right w:val="single" w:sz="4" w:space="4" w:color="BFBFBF"/>
+        </w:pBdr>
+        <w:shd w:val="clear" w:color="auto" w:fill="F2F2F2"/>
+        <w:ind w:left="120" w:right="120"/>
+      </w:pPr>
+      <w:r>
+        <w:rPr>
+          <w:rFonts w:ascii="Consolas" w:eastAsia="Consolas" w:hAnsi="Consolas" w:cs="Consolas"/>
+          <w:color w:val="1E1E1E"/>
+          <w:sz w:val="18"/>
+          <w:szCs w:val="18"/>
+        </w:rPr>
+        <w:t>record:</w:t>
+      </w:r>
+    </w:p>
+    <w:p>
+      <w:pPr>
+        <w:pBdr>
+          <w:left w:val="single" w:sz="4" w:space="4" w:color="BFBFBF"/>
+          <w:right w:val="single" w:sz="4" w:space="4" w:color="BFBFBF"/>
+        </w:pBdr>
+        <w:shd w:val="clear" w:color="auto" w:fill="F2F2F2"/>
+        <w:ind w:left="120" w:right="120"/>
+      </w:pPr>
+      <w:r>
+        <w:rPr>
+          <w:rFonts w:ascii="Consolas" w:eastAsia="Consolas" w:hAnsi="Consolas" w:cs="Consolas"/>
+          <w:color w:val="1E1E1E"/>
+          <w:sz w:val="18"/>
+          <w:szCs w:val="18"/>
+        </w:rPr>
+        <w:t xml:space="preserve">  enabled: true</w:t>
+      </w:r>
+    </w:p>
+    <w:p>
+      <w:pPr>
+        <w:pBdr>
+          <w:left w:val="single" w:sz="4" w:space="4" w:color="BFBFBF"/>
+          <w:right w:val="single" w:sz="4" w:space="4" w:color="BFBFBF"/>
+        </w:pBdr>
+        <w:shd w:val="clear" w:color="auto" w:fill="F2F2F2"/>
+        <w:ind w:left="120" w:right="120"/>
+      </w:pPr>
+      <w:r>
+        <w:rPr>
+          <w:rFonts w:ascii="Consolas" w:eastAsia="Consolas" w:hAnsi="Consolas" w:cs="Consolas"/>
+          <w:color w:val="1E1E1E"/>
+          <w:sz w:val="18"/>
+          <w:szCs w:val="18"/>
+        </w:rPr>
+        <w:t xml:space="preserve">  continuous:</w:t>
+      </w:r>
+    </w:p>
+    <w:p>
+      <w:pPr>
+        <w:pBdr>
+          <w:left w:val="single" w:sz="4" w:space="4" w:color="BFBFBF"/>
+          <w:right w:val="single" w:sz="4" w:space="4" w:color="BFBFBF"/>
+        </w:pBdr>
+        <w:shd w:val="clear" w:color="auto" w:fill="F2F2F2"/>
+        <w:ind w:left="120" w:right="120"/>
+      </w:pPr>
+      <w:r>
+        <w:rPr>
+          <w:rFonts w:ascii="Consolas" w:eastAsia="Consolas" w:hAnsi="Consolas" w:cs="Consolas"/>
+          <w:color w:val="1E1E1E"/>
+          <w:sz w:val="18"/>
+          <w:szCs w:val="18"/>
+        </w:rPr>
+        <w:t xml:space="preserve">    days: 0          # sin grabación continua</w:t>
+      </w:r>
+    </w:p>
+    <w:p>
+      <w:pPr>
+        <w:pBdr>
+          <w:left w:val="single" w:sz="4" w:space="4" w:color="BFBFBF"/>
+          <w:right w:val="single" w:sz="4" w:space="4" w:color="BFBFBF"/>
+        </w:pBdr>
+        <w:shd w:val="clear" w:color="auto" w:fill="F2F2F2"/>
+        <w:ind w:left="120" w:right="120"/>
+      </w:pPr>
+      <w:r>
+        <w:rPr>
+          <w:rFonts w:ascii="Consolas" w:eastAsia="Consolas" w:hAnsi="Consolas" w:cs="Consolas"/>
+          <w:color w:val="1E1E1E"/>
+          <w:sz w:val="18"/>
+          <w:szCs w:val="18"/>
+        </w:rPr>
+        <w:t xml:space="preserve">  motion:</w:t>
+      </w:r>
+    </w:p>
+    <w:p>
+      <w:pPr>
+        <w:pBdr>
+          <w:left w:val="single" w:sz="4" w:space="4" w:color="BFBFBF"/>
+          <w:right w:val="single" w:sz="4" w:space="4" w:color="BFBFBF"/>
+        </w:pBdr>
+        <w:shd w:val="clear" w:color="auto" w:fill="F2F2F2"/>
+        <w:ind w:left="120" w:right="120"/>
+      </w:pPr>
+      <w:r>
+        <w:rPr>
+          <w:rFonts w:ascii="Consolas" w:eastAsia="Consolas" w:hAnsi="Consolas" w:cs="Consolas"/>
+          <w:color w:val="1E1E1E"/>
+          <w:sz w:val="18"/>
+          <w:szCs w:val="18"/>
+        </w:rPr>
+        <w:t xml:space="preserve">    days: 0          # sin grabación por solo movimiento</w:t>
+      </w:r>
+    </w:p>
+    <w:p>
+      <w:pPr>
+        <w:pBdr>
+          <w:left w:val="single" w:sz="4" w:space="4" w:color="BFBFBF"/>
+          <w:right w:val="single" w:sz="4" w:space="4" w:color="BFBFBF"/>
+        </w:pBdr>
+        <w:shd w:val="clear" w:color="auto" w:fill="F2F2F2"/>
+        <w:ind w:left="120" w:right="120"/>
+      </w:pPr>
+      <w:r>
+        <w:rPr>
+          <w:rFonts w:ascii="Consolas" w:eastAsia="Consolas" w:hAnsi="Consolas" w:cs="Consolas"/>
+          <w:color w:val="1E1E1E"/>
+          <w:sz w:val="18"/>
+          <w:szCs w:val="18"/>
+        </w:rPr>
+        <w:t xml:space="preserve">  alerts:</w:t>
+      </w:r>
+    </w:p>
+    <w:p>
+      <w:pPr>
+        <w:pBdr>
+          <w:left w:val="single" w:sz="4" w:space="4" w:color="BFBFBF"/>
+          <w:right w:val="single" w:sz="4" w:space="4" w:color="BFBFBF"/>
+        </w:pBdr>
+        <w:shd w:val="clear" w:color="auto" w:fill="F2F2F2"/>
+        <w:ind w:left="120" w:right="120"/>
+      </w:pPr>
+      <w:r>
+        <w:rPr>
+          <w:rFonts w:ascii="Consolas" w:eastAsia="Consolas" w:hAnsi="Consolas" w:cs="Consolas"/>
+          <w:color w:val="1E1E1E"/>
+          <w:sz w:val="18"/>
+          <w:szCs w:val="18"/>
+        </w:rPr>
+        <w:t xml:space="preserve">    retain:</w:t>
+      </w:r>
+    </w:p>
+    <w:p>
+      <w:pPr>
+        <w:pBdr>
+          <w:left w:val="single" w:sz="4" w:space="4" w:color="BFBFBF"/>
+          <w:right w:val="single" w:sz="4" w:space="4" w:color="BFBFBF"/>
+        </w:pBdr>
+        <w:shd w:val="clear" w:color="auto" w:fill="F2F2F2"/>
+        <w:ind w:left="120" w:right="120"/>
+      </w:pPr>
+      <w:r>
+        <w:rPr>
+          <w:rFonts w:ascii="Consolas" w:eastAsia="Consolas" w:hAnsi="Consolas" w:cs="Consolas"/>
+          <w:color w:val="1E1E1E"/>
+          <w:sz w:val="18"/>
+          <w:szCs w:val="18"/>
+        </w:rPr>
+        <w:t xml:space="preserve">      days: 7</w:t>
+      </w:r>
+    </w:p>
+    <w:p>
+      <w:pPr>
+        <w:pBdr>
+          <w:left w:val="single" w:sz="4" w:space="4" w:color="BFBFBF"/>
+          <w:right w:val="single" w:sz="4" w:space="4" w:color="BFBFBF"/>
+        </w:pBdr>
+        <w:shd w:val="clear" w:color="auto" w:fill="F2F2F2"/>
+        <w:ind w:left="120" w:right="120"/>
+      </w:pPr>
+      <w:r>
+        <w:rPr>
+          <w:rFonts w:ascii="Consolas" w:eastAsia="Consolas" w:hAnsi="Consolas" w:cs="Consolas"/>
+          <w:color w:val="1E1E1E"/>
+          <w:sz w:val="18"/>
+          <w:szCs w:val="18"/>
+        </w:rPr>
+        <w:t xml:space="preserve">      mode: active_objects</w:t>
+      </w:r>
+    </w:p>
+    <w:p>
+      <w:pPr>
+        <w:pBdr>
+          <w:left w:val="single" w:sz="4" w:space="4" w:color="BFBFBF"/>
+          <w:right w:val="single" w:sz="4" w:space="4" w:color="BFBFBF"/>
+        </w:pBdr>
+        <w:shd w:val="clear" w:color="auto" w:fill="F2F2F2"/>
+        <w:ind w:left="120" w:right="120"/>
+      </w:pPr>
+      <w:r>
+        <w:rPr>
+          <w:rFonts w:ascii="Consolas" w:eastAsia="Consolas" w:hAnsi="Consolas" w:cs="Consolas"/>
+          <w:color w:val="1E1E1E"/>
+          <w:sz w:val="18"/>
+          <w:szCs w:val="18"/>
+        </w:rPr>
+        <w:t xml:space="preserve">  detections:</w:t>
+      </w:r>
+    </w:p>
+    <w:p>
+      <w:pPr>
+        <w:pBdr>
+          <w:left w:val="single" w:sz="4" w:space="4" w:color="BFBFBF"/>
+          <w:right w:val="single" w:sz="4" w:space="4" w:color="BFBFBF"/>
+        </w:pBdr>
+        <w:shd w:val="clear" w:color="auto" w:fill="F2F2F2"/>
+        <w:ind w:left="120" w:right="120"/>
+      </w:pPr>
+      <w:r>
+        <w:rPr>
+          <w:rFonts w:ascii="Consolas" w:eastAsia="Consolas" w:hAnsi="Consolas" w:cs="Consolas"/>
+          <w:color w:val="1E1E1E"/>
+          <w:sz w:val="18"/>
+          <w:szCs w:val="18"/>
+        </w:rPr>
+        <w:t xml:space="preserve">    retain:</w:t>
+      </w:r>
+    </w:p>
+    <w:p>
+      <w:pPr>
+        <w:pBdr>
+          <w:left w:val="single" w:sz="4" w:space="4" w:color="BFBFBF"/>
+          <w:right w:val="single" w:sz="4" w:space="4" w:color="BFBFBF"/>
+        </w:pBdr>
+        <w:shd w:val="clear" w:color="auto" w:fill="F2F2F2"/>
+        <w:ind w:left="120" w:right="120"/>
+      </w:pPr>
+      <w:r>
+        <w:rPr>
+          <w:rFonts w:ascii="Consolas" w:eastAsia="Consolas" w:hAnsi="Consolas" w:cs="Consolas"/>
+          <w:color w:val="1E1E1E"/>
+          <w:sz w:val="18"/>
+          <w:szCs w:val="18"/>
+        </w:rPr>
+        <w:t xml:space="preserve">      days: 7</w:t>
+      </w:r>
+    </w:p>
+    <w:p>
+      <w:pPr>
+        <w:pBdr>
+          <w:left w:val="single" w:sz="4" w:space="4" w:color="BFBFBF"/>
+          <w:bottom w:val="single" w:sz="4" w:space="4" w:color="BFBFBF"/>
+          <w:right w:val="single" w:sz="4" w:space="4" w:color="BFBFBF"/>
+        </w:pBdr>
+        <w:shd w:val="clear" w:color="auto" w:fill="F2F2F2"/>
+        <w:spacing w:after="160"/>
+        <w:ind w:left="120" w:right="120"/>
+      </w:pPr>
+      <w:r>
+        <w:rPr>
+          <w:rFonts w:ascii="Consolas" w:eastAsia="Consolas" w:hAnsi="Consolas" w:cs="Consolas"/>
+          <w:color w:val="1E1E1E"/>
+          <w:sz w:val="18"/>
+          <w:szCs w:val="18"/>
+        </w:rPr>
+        <w:t xml:space="preserve">      mode: active_objects</w:t>
+      </w:r>
+    </w:p>
+    <w:p>
+      <w:pPr>
+        <w:pStyle w:val="Prrafodelista"/>
+        <w:numPr>
+          <w:ilvl w:val="0"/>
+          <w:numId w:val="2"/>
+        </w:numPr>
+        <w:spacing w:after="60"/>
+      </w:pPr>
+      <w:r>
+        <w:rPr>
+          <w:b/>
+          <w:bCs/>
+        </w:rPr>
+        <w:t>Cámaras iCSee nuevas (DVRIP):</w:t>
+      </w:r>
+      <w:r>
+        <w:t xml:space="preserve"> grabarlas sin audio (10.5) vale para cualquier equipo.</w:t>
+      </w:r>
+    </w:p>
+    <w:p>
+      <w:pPr>
+        <w:pStyle w:val="Ttulo2"/>
+      </w:pPr>
+      <w:bookmarkStart w:id="55" w:name="_Toc242704491"/>
+      <w:r>
+        <w:t>18.3 Modelos de referencia</w:t>
+      </w:r>
+      <w:bookmarkEnd w:id="55"/>
+    </w:p>
+    <w:p>
+      <w:pPr>
+        <w:spacing w:after="120" w:line="276" w:lineRule="auto"/>
+      </w:pPr>
+      <w:r>
+        <w:t>Precios vistos el 12/10/2026; cambian a diario y deben verificarse al comprar, incluyendo IVA, envío y garantía local.</w:t>
+      </w:r>
+    </w:p>
+    <w:tbl>
+      <w:tblPr>
+        <w:tblW w:w="9026" w:type="dxa"/>
+        <w:tblBorders>
+          <w:top w:val="single" w:sz="4" w:space="0" w:color="auto"/>
+          <w:left w:val="single" w:sz="4" w:space="0" w:color="auto"/>
+          <w:bottom w:val="single" w:sz="4" w:space="0" w:color="auto"/>
+          <w:right w:val="single" w:sz="4" w:space="0" w:color="auto"/>
+          <w:insideH w:val="single" w:sz="4" w:space="0" w:color="auto"/>
+          <w:insideV w:val="single" w:sz="4" w:space="0" w:color="auto"/>
+        </w:tblBorders>
+        <w:tblCellMar>
+          <w:left w:w="10" w:type="dxa"/>
+          <w:right w:w="10" w:type="dxa"/>
+        </w:tblCellMar>
+        <w:tblLook w:val="0000" w:firstRow="0" w:lastRow="0" w:firstColumn="0" w:lastColumn="0" w:noHBand="0" w:noVBand="0"/>
       </w:tblPr>
       <w:tblGrid>
         <w:gridCol w:w="2214"/>
@@ -36276,6 +37205,7 @@
                 <w:sz w:val="19"/>
                 <w:szCs w:val="19"/>
               </w:rPr>
+              <w:lastRenderedPageBreak/>
               <w:t>GEEKOM IT12 / Beelink SEi12</w:t>
             </w:r>
           </w:p>
@@ -36533,10 +37463,10 @@
 <file path=word/numbering.xml><?xml version="1.0" encoding="utf-8"?>
 <w:numbering xmlns:wpc="http://schemas.microsoft.com/office/word/2010/wordprocessingCanvas" xmlns:cx="http://schemas.microsoft.com/office/drawing/2014/chartex" xmlns:cx1="http://schemas.microsoft.com/office/drawing/2015/9/8/chartex" xmlns:cx2="http://schemas.microsoft.com/office/drawing/2015/10/21/chartex" xmlns:cx3="http://schemas.microsoft.com/office/drawing/2016/5/9/chartex" xmlns:cx4="http://schemas.microsoft.com/office/drawing/2016/5/10/chartex" xmlns:cx5="http://schemas.microsoft.com/office/drawing/2016/5/11/chartex" xmlns:cx6="http://schemas.microsoft.com/office/drawing/2016/5/12/chartex" xmlns:cx7="http://schemas.microsoft.com/office/drawing/2016/5/13/chartex" xmlns:cx8="http://schemas.microsoft.com/office/drawing/2016/5/14/chartex" xmlns:mc="http://schemas.openxmlformats.org/markup-compatibility/2006" xmlns:aink="http://schemas.microsoft.com/office/drawing/2016/ink" xmlns:am3d="http://schemas.microsoft.com/office/drawing/2017/model3d" xmlns:o="urn:schemas-microsoft-com:office:office" xmlns:oel="http://schemas.microsoft.com/office/2019/extlst" xmlns:r="http://schemas.openxmlformats.org/officeDocument/2006/relationships" xmlns:m="http://schemas.openxmlformats.org/officeDocument/2006/math" xmlns:v="urn:schemas-microsoft-com:vml" xmlns:wp14="http://schemas.microsoft.com/office/word/2010/wordprocessingDrawing" xmlns:wp="http://schemas.openxmlformats.org/drawingml/2006/wordprocessingDrawing" xmlns:w10="urn:schemas-microsoft-com:office:word" xmlns:w="http://schemas.openxmlformats.org/wordprocessingml/2006/main" xmlns:w14="http://schemas.microsoft.com/office/word/2010/wordml" xmlns:w15="http://schemas.microsoft.com/office/word/2012/wordml" xmlns:w16cex="http://schemas.microsoft.com/office/word/2018/wordml/cex" xmlns:w16cid="http://schemas.microsoft.com/office/word/2016/wordml/cid" xmlns:w16="http://schemas.microsoft.com/office/word/2018/wordml" xmlns:w16du="http://schemas.microsoft.com/office/word/2023/wordml/word16du" xmlns:w16sdtdh="http://schemas.microsoft.com/office/word/2020/wordml/sdtdatahash" xmlns:w16sdtfl="http://schemas.microsoft.com/office/word/2024/wordml/sdtformatlock" xmlns:w16se="http://schemas.microsoft.com/office/word/2015/wordml/symex" xmlns:wpg="http://schemas.microsoft.com/office/word/2010/wordprocessingGroup" xmlns:wpi="http://schemas.microsoft.com/office/word/2010/wordprocessingInk" xmlns:wne="http://schemas.microsoft.com/office/word/2006/wordml" xmlns:wps="http://schemas.microsoft.com/office/word/2010/wordprocessingShape" mc:Ignorable="w14 w15 w16se w16cid w16 w16cex w16sdtdh w16sdtfl w16du wp14">
   <w:abstractNum w:abstractNumId="0" w15:restartNumberingAfterBreak="0">
-    <w:nsid w:val="011373BB"/>
+    <w:nsid w:val="0B643634"/>
     <w:multiLevelType w:val="hybridMultilevel"/>
-    <w:tmpl w:val="431E447A"/>
-    <w:lvl w:ilvl="0" w:tplc="7122939A">
+    <w:tmpl w:val="38C8B32C"/>
+    <w:lvl w:ilvl="0" w:tplc="20940DF0">
       <w:start w:val="1"/>
       <w:numFmt w:val="decimal"/>
       <w:lvlText w:val="%1."/>
@@ -36545,52 +37475,52 @@
         <w:ind w:left="540" w:hanging="360"/>
       </w:pPr>
     </w:lvl>
-    <w:lvl w:ilvl="1" w:tplc="0A105B38">
+    <w:lvl w:ilvl="1" w:tplc="F70C3E2E">
       <w:numFmt w:val="decimal"/>
       <w:lvlText w:val=""/>
       <w:lvlJc w:val="left"/>
     </w:lvl>
-    <w:lvl w:ilvl="2" w:tplc="FCE6C1FA">
+    <w:lvl w:ilvl="2" w:tplc="BA4CA1EC">
       <w:numFmt w:val="decimal"/>
       <w:lvlText w:val=""/>
       <w:lvlJc w:val="left"/>
     </w:lvl>
-    <w:lvl w:ilvl="3" w:tplc="30AA3F48">
+    <w:lvl w:ilvl="3" w:tplc="71425004">
       <w:numFmt w:val="decimal"/>
       <w:lvlText w:val=""/>
       <w:lvlJc w:val="left"/>
     </w:lvl>
-    <w:lvl w:ilvl="4" w:tplc="23D27EE2">
+    <w:lvl w:ilvl="4" w:tplc="15D88634">
       <w:numFmt w:val="decimal"/>
       <w:lvlText w:val=""/>
       <w:lvlJc w:val="left"/>
     </w:lvl>
-    <w:lvl w:ilvl="5" w:tplc="0D26C10C">
+    <w:lvl w:ilvl="5" w:tplc="F0C44C5C">
       <w:numFmt w:val="decimal"/>
       <w:lvlText w:val=""/>
       <w:lvlJc w:val="left"/>
     </w:lvl>
-    <w:lvl w:ilvl="6" w:tplc="9FE6EBB0">
+    <w:lvl w:ilvl="6" w:tplc="F54882B8">
       <w:numFmt w:val="decimal"/>
       <w:lvlText w:val=""/>
       <w:lvlJc w:val="left"/>
     </w:lvl>
-    <w:lvl w:ilvl="7" w:tplc="5390357A">
+    <w:lvl w:ilvl="7" w:tplc="6218BF7A">
       <w:numFmt w:val="decimal"/>
       <w:lvlText w:val=""/>
       <w:lvlJc w:val="left"/>
     </w:lvl>
-    <w:lvl w:ilvl="8" w:tplc="FA147476">
+    <w:lvl w:ilvl="8" w:tplc="1C3A2098">
       <w:numFmt w:val="decimal"/>
       <w:lvlText w:val=""/>
       <w:lvlJc w:val="left"/>
     </w:lvl>
   </w:abstractNum>
   <w:abstractNum w:abstractNumId="1" w15:restartNumberingAfterBreak="0">
-    <w:nsid w:val="03200E28"/>
+    <w:nsid w:val="1230705E"/>
     <w:multiLevelType w:val="hybridMultilevel"/>
-    <w:tmpl w:val="7AC68216"/>
-    <w:lvl w:ilvl="0" w:tplc="017ADC04">
+    <w:tmpl w:val="4D0C53AC"/>
+    <w:lvl w:ilvl="0" w:tplc="67DA8E94">
       <w:start w:val="1"/>
       <w:numFmt w:val="decimal"/>
       <w:lvlText w:val="%1."/>
@@ -36599,52 +37529,106 @@
         <w:ind w:left="540" w:hanging="360"/>
       </w:pPr>
     </w:lvl>
-    <w:lvl w:ilvl="1" w:tplc="31504638">
+    <w:lvl w:ilvl="1" w:tplc="46904EEA">
       <w:numFmt w:val="decimal"/>
       <w:lvlText w:val=""/>
       <w:lvlJc w:val="left"/>
     </w:lvl>
-    <w:lvl w:ilvl="2" w:tplc="2782FC16">
+    <w:lvl w:ilvl="2" w:tplc="BAB0A150">
       <w:numFmt w:val="decimal"/>
       <w:lvlText w:val=""/>
       <w:lvlJc w:val="left"/>
     </w:lvl>
-    <w:lvl w:ilvl="3" w:tplc="7E8E9CD4">
+    <w:lvl w:ilvl="3" w:tplc="1AE8AC8A">
       <w:numFmt w:val="decimal"/>
       <w:lvlText w:val=""/>
       <w:lvlJc w:val="left"/>
     </w:lvl>
-    <w:lvl w:ilvl="4" w:tplc="E2F21364">
+    <w:lvl w:ilvl="4" w:tplc="9B582134">
       <w:numFmt w:val="decimal"/>
       <w:lvlText w:val=""/>
       <w:lvlJc w:val="left"/>
     </w:lvl>
-    <w:lvl w:ilvl="5" w:tplc="4F28100E">
+    <w:lvl w:ilvl="5" w:tplc="44EEF5AA">
       <w:numFmt w:val="decimal"/>
       <w:lvlText w:val=""/>
       <w:lvlJc w:val="left"/>
     </w:lvl>
-    <w:lvl w:ilvl="6" w:tplc="34F4E050">
+    <w:lvl w:ilvl="6" w:tplc="3856A4B2">
       <w:numFmt w:val="decimal"/>
       <w:lvlText w:val=""/>
       <w:lvlJc w:val="left"/>
     </w:lvl>
-    <w:lvl w:ilvl="7" w:tplc="1C14AEB0">
+    <w:lvl w:ilvl="7" w:tplc="CB06618A">
       <w:numFmt w:val="decimal"/>
       <w:lvlText w:val=""/>
       <w:lvlJc w:val="left"/>
     </w:lvl>
-    <w:lvl w:ilvl="8" w:tplc="4364D650">
+    <w:lvl w:ilvl="8" w:tplc="896C66E8">
       <w:numFmt w:val="decimal"/>
       <w:lvlText w:val=""/>
       <w:lvlJc w:val="left"/>
     </w:lvl>
   </w:abstractNum>
   <w:abstractNum w:abstractNumId="2" w15:restartNumberingAfterBreak="0">
-    <w:nsid w:val="1E350C08"/>
+    <w:nsid w:val="28A91EF0"/>
     <w:multiLevelType w:val="hybridMultilevel"/>
-    <w:tmpl w:val="97D07A70"/>
-    <w:lvl w:ilvl="0" w:tplc="91D6214E">
+    <w:tmpl w:val="413064CC"/>
+    <w:lvl w:ilvl="0" w:tplc="3DF4288C">
+      <w:start w:val="1"/>
+      <w:numFmt w:val="decimal"/>
+      <w:lvlText w:val="%1."/>
+      <w:lvlJc w:val="left"/>
+      <w:pPr>
+        <w:ind w:left="540" w:hanging="360"/>
+      </w:pPr>
+    </w:lvl>
+    <w:lvl w:ilvl="1" w:tplc="F35A56CC">
+      <w:numFmt w:val="decimal"/>
+      <w:lvlText w:val=""/>
+      <w:lvlJc w:val="left"/>
+    </w:lvl>
+    <w:lvl w:ilvl="2" w:tplc="60DE9076">
+      <w:numFmt w:val="decimal"/>
+      <w:lvlText w:val=""/>
+      <w:lvlJc w:val="left"/>
+    </w:lvl>
+    <w:lvl w:ilvl="3" w:tplc="A494454C">
+      <w:numFmt w:val="decimal"/>
+      <w:lvlText w:val=""/>
+      <w:lvlJc w:val="left"/>
+    </w:lvl>
+    <w:lvl w:ilvl="4" w:tplc="D50CBF32">
+      <w:numFmt w:val="decimal"/>
+      <w:lvlText w:val=""/>
+      <w:lvlJc w:val="left"/>
+    </w:lvl>
+    <w:lvl w:ilvl="5" w:tplc="812C088E">
+      <w:numFmt w:val="decimal"/>
+      <w:lvlText w:val=""/>
+      <w:lvlJc w:val="left"/>
+    </w:lvl>
+    <w:lvl w:ilvl="6" w:tplc="98E88138">
+      <w:numFmt w:val="decimal"/>
+      <w:lvlText w:val=""/>
+      <w:lvlJc w:val="left"/>
+    </w:lvl>
+    <w:lvl w:ilvl="7" w:tplc="AE384284">
+      <w:numFmt w:val="decimal"/>
+      <w:lvlText w:val=""/>
+      <w:lvlJc w:val="left"/>
+    </w:lvl>
+    <w:lvl w:ilvl="8" w:tplc="126AD37E">
+      <w:numFmt w:val="decimal"/>
+      <w:lvlText w:val=""/>
+      <w:lvlJc w:val="left"/>
+    </w:lvl>
+  </w:abstractNum>
+  <w:abstractNum w:abstractNumId="3" w15:restartNumberingAfterBreak="0">
+    <w:nsid w:val="29BE0A82"/>
+    <w:multiLevelType w:val="hybridMultilevel"/>
+    <w:tmpl w:val="92429630"/>
+    <w:lvl w:ilvl="0" w:tplc="56DA532C">
       <w:start w:val="1"/>
       <w:numFmt w:val="bullet"/>
       <w:lvlText w:val="•"/>
@@ -36653,52 +37637,52 @@
         <w:ind w:left="540" w:hanging="360"/>
       </w:pPr>
     </w:lvl>
-    <w:lvl w:ilvl="1" w:tplc="2E48FC6E">
+    <w:lvl w:ilvl="1" w:tplc="2D743CE0">
       <w:numFmt w:val="decimal"/>
       <w:lvlText w:val=""/>
       <w:lvlJc w:val="left"/>
     </w:lvl>
-    <w:lvl w:ilvl="2" w:tplc="C43E0770">
+    <w:lvl w:ilvl="2" w:tplc="CB7E22FC">
       <w:numFmt w:val="decimal"/>
       <w:lvlText w:val=""/>
       <w:lvlJc w:val="left"/>
     </w:lvl>
-    <w:lvl w:ilvl="3" w:tplc="9F506F3C">
+    <w:lvl w:ilvl="3" w:tplc="5E5663DC">
       <w:numFmt w:val="decimal"/>
       <w:lvlText w:val=""/>
       <w:lvlJc w:val="left"/>
     </w:lvl>
-    <w:lvl w:ilvl="4" w:tplc="F2147B9A">
+    <w:lvl w:ilvl="4" w:tplc="721AD826">
       <w:numFmt w:val="decimal"/>
       <w:lvlText w:val=""/>
       <w:lvlJc w:val="left"/>
     </w:lvl>
-    <w:lvl w:ilvl="5" w:tplc="447A4AA2">
+    <w:lvl w:ilvl="5" w:tplc="BCB85458">
       <w:numFmt w:val="decimal"/>
       <w:lvlText w:val=""/>
       <w:lvlJc w:val="left"/>
     </w:lvl>
-    <w:lvl w:ilvl="6" w:tplc="8BB417B8">
+    <w:lvl w:ilvl="6" w:tplc="48FC7054">
       <w:numFmt w:val="decimal"/>
       <w:lvlText w:val=""/>
       <w:lvlJc w:val="left"/>
     </w:lvl>
-    <w:lvl w:ilvl="7" w:tplc="49E2CF2A">
+    <w:lvl w:ilvl="7" w:tplc="E43C7D80">
       <w:numFmt w:val="decimal"/>
       <w:lvlText w:val=""/>
       <w:lvlJc w:val="left"/>
     </w:lvl>
-    <w:lvl w:ilvl="8" w:tplc="24CC166C">
+    <w:lvl w:ilvl="8" w:tplc="3E18AEF6">
       <w:numFmt w:val="decimal"/>
       <w:lvlText w:val=""/>
       <w:lvlJc w:val="left"/>
     </w:lvl>
   </w:abstractNum>
-  <w:abstractNum w:abstractNumId="3" w15:restartNumberingAfterBreak="0">
-    <w:nsid w:val="294039FD"/>
+  <w:abstractNum w:abstractNumId="4" w15:restartNumberingAfterBreak="0">
+    <w:nsid w:val="49C67FA1"/>
     <w:multiLevelType w:val="hybridMultilevel"/>
-    <w:tmpl w:val="A62A13F4"/>
-    <w:lvl w:ilvl="0" w:tplc="FFBC7ABA">
+    <w:tmpl w:val="42C26898"/>
+    <w:lvl w:ilvl="0" w:tplc="08A05DB2">
       <w:start w:val="1"/>
       <w:numFmt w:val="decimal"/>
       <w:lvlText w:val="%1."/>
@@ -36707,52 +37691,52 @@
         <w:ind w:left="540" w:hanging="360"/>
       </w:pPr>
     </w:lvl>
-    <w:lvl w:ilvl="1" w:tplc="C9AEA75A">
+    <w:lvl w:ilvl="1" w:tplc="E36AE0F8">
       <w:numFmt w:val="decimal"/>
       <w:lvlText w:val=""/>
       <w:lvlJc w:val="left"/>
     </w:lvl>
-    <w:lvl w:ilvl="2" w:tplc="BD946634">
+    <w:lvl w:ilvl="2" w:tplc="2B0E236E">
       <w:numFmt w:val="decimal"/>
       <w:lvlText w:val=""/>
       <w:lvlJc w:val="left"/>
     </w:lvl>
-    <w:lvl w:ilvl="3" w:tplc="54140080">
+    <w:lvl w:ilvl="3" w:tplc="A2B688B0">
       <w:numFmt w:val="decimal"/>
       <w:lvlText w:val=""/>
       <w:lvlJc w:val="left"/>
     </w:lvl>
-    <w:lvl w:ilvl="4" w:tplc="A0E63C70">
+    <w:lvl w:ilvl="4" w:tplc="497455C0">
       <w:numFmt w:val="decimal"/>
       <w:lvlText w:val=""/>
       <w:lvlJc w:val="left"/>
     </w:lvl>
-    <w:lvl w:ilvl="5" w:tplc="E89E9F4A">
+    <w:lvl w:ilvl="5" w:tplc="11509E30">
       <w:numFmt w:val="decimal"/>
       <w:lvlText w:val=""/>
       <w:lvlJc w:val="left"/>
     </w:lvl>
-    <w:lvl w:ilvl="6" w:tplc="7BFE4858">
+    <w:lvl w:ilvl="6" w:tplc="300A702A">
       <w:numFmt w:val="decimal"/>
       <w:lvlText w:val=""/>
       <w:lvlJc w:val="left"/>
     </w:lvl>
-    <w:lvl w:ilvl="7" w:tplc="D02012BC">
+    <w:lvl w:ilvl="7" w:tplc="54FE2A90">
       <w:numFmt w:val="decimal"/>
       <w:lvlText w:val=""/>
       <w:lvlJc w:val="left"/>
     </w:lvl>
-    <w:lvl w:ilvl="8" w:tplc="F976C040">
+    <w:lvl w:ilvl="8" w:tplc="4A82BA94">
       <w:numFmt w:val="decimal"/>
       <w:lvlText w:val=""/>
       <w:lvlJc w:val="left"/>
     </w:lvl>
   </w:abstractNum>
-  <w:abstractNum w:abstractNumId="4" w15:restartNumberingAfterBreak="0">
-    <w:nsid w:val="2D926FC2"/>
+  <w:abstractNum w:abstractNumId="5" w15:restartNumberingAfterBreak="0">
+    <w:nsid w:val="4AE33784"/>
     <w:multiLevelType w:val="hybridMultilevel"/>
-    <w:tmpl w:val="5BAAFE7C"/>
-    <w:lvl w:ilvl="0" w:tplc="9E28F586">
+    <w:tmpl w:val="15AA6C34"/>
+    <w:lvl w:ilvl="0" w:tplc="A496A83A">
       <w:start w:val="1"/>
       <w:numFmt w:val="decimal"/>
       <w:lvlText w:val="%1."/>
@@ -36761,52 +37745,52 @@
         <w:ind w:left="540" w:hanging="360"/>
       </w:pPr>
     </w:lvl>
-    <w:lvl w:ilvl="1" w:tplc="E1A86DC0">
+    <w:lvl w:ilvl="1" w:tplc="52CCB8D4">
       <w:numFmt w:val="decimal"/>
       <w:lvlText w:val=""/>
       <w:lvlJc w:val="left"/>
     </w:lvl>
-    <w:lvl w:ilvl="2" w:tplc="E16C9F28">
+    <w:lvl w:ilvl="2" w:tplc="313C1FA4">
       <w:numFmt w:val="decimal"/>
       <w:lvlText w:val=""/>
       <w:lvlJc w:val="left"/>
     </w:lvl>
-    <w:lvl w:ilvl="3" w:tplc="5D44676A">
+    <w:lvl w:ilvl="3" w:tplc="57EAFF2A">
       <w:numFmt w:val="decimal"/>
       <w:lvlText w:val=""/>
       <w:lvlJc w:val="left"/>
     </w:lvl>
-    <w:lvl w:ilvl="4" w:tplc="EE24941A">
+    <w:lvl w:ilvl="4" w:tplc="9760C470">
       <w:numFmt w:val="decimal"/>
       <w:lvlText w:val=""/>
       <w:lvlJc w:val="left"/>
     </w:lvl>
-    <w:lvl w:ilvl="5" w:tplc="3F1806E4">
+    <w:lvl w:ilvl="5" w:tplc="98765A54">
       <w:numFmt w:val="decimal"/>
       <w:lvlText w:val=""/>
       <w:lvlJc w:val="left"/>
     </w:lvl>
-    <w:lvl w:ilvl="6" w:tplc="CA7CA2E8">
+    <w:lvl w:ilvl="6" w:tplc="DED8BF5A">
       <w:numFmt w:val="decimal"/>
       <w:lvlText w:val=""/>
       <w:lvlJc w:val="left"/>
     </w:lvl>
-    <w:lvl w:ilvl="7" w:tplc="43BCE402">
+    <w:lvl w:ilvl="7" w:tplc="8276775C">
       <w:numFmt w:val="decimal"/>
       <w:lvlText w:val=""/>
       <w:lvlJc w:val="left"/>
     </w:lvl>
-    <w:lvl w:ilvl="8" w:tplc="CD32A014">
+    <w:lvl w:ilvl="8" w:tplc="9AD8B934">
       <w:numFmt w:val="decimal"/>
       <w:lvlText w:val=""/>
       <w:lvlJc w:val="left"/>
     </w:lvl>
   </w:abstractNum>
-  <w:abstractNum w:abstractNumId="5" w15:restartNumberingAfterBreak="0">
-    <w:nsid w:val="3A395C1C"/>
+  <w:abstractNum w:abstractNumId="6" w15:restartNumberingAfterBreak="0">
+    <w:nsid w:val="689B5087"/>
     <w:multiLevelType w:val="hybridMultilevel"/>
-    <w:tmpl w:val="EC4E0C9E"/>
-    <w:lvl w:ilvl="0" w:tplc="847C2D20">
+    <w:tmpl w:val="2BCCA29E"/>
+    <w:lvl w:ilvl="0" w:tplc="FA8A3488">
       <w:start w:val="1"/>
       <w:numFmt w:val="decimal"/>
       <w:lvlText w:val="%1."/>
@@ -36815,160 +37799,52 @@
         <w:ind w:left="540" w:hanging="360"/>
       </w:pPr>
     </w:lvl>
-    <w:lvl w:ilvl="1" w:tplc="AF20E1AE">
+    <w:lvl w:ilvl="1" w:tplc="A7420386">
       <w:numFmt w:val="decimal"/>
       <w:lvlText w:val=""/>
       <w:lvlJc w:val="left"/>
     </w:lvl>
-    <w:lvl w:ilvl="2" w:tplc="62B2E4C4">
+    <w:lvl w:ilvl="2" w:tplc="6C16EE12">
       <w:numFmt w:val="decimal"/>
       <w:lvlText w:val=""/>
       <w:lvlJc w:val="left"/>
     </w:lvl>
-    <w:lvl w:ilvl="3" w:tplc="D3168B90">
+    <w:lvl w:ilvl="3" w:tplc="BA5E388C">
       <w:numFmt w:val="decimal"/>
       <w:lvlText w:val=""/>
       <w:lvlJc w:val="left"/>
     </w:lvl>
-    <w:lvl w:ilvl="4" w:tplc="735AD7BA">
+    <w:lvl w:ilvl="4" w:tplc="9FAC3658">
       <w:numFmt w:val="decimal"/>
       <w:lvlText w:val=""/>
       <w:lvlJc w:val="left"/>
     </w:lvl>
-    <w:lvl w:ilvl="5" w:tplc="7C0090DA">
+    <w:lvl w:ilvl="5" w:tplc="31F0452E">
       <w:numFmt w:val="decimal"/>
       <w:lvlText w:val=""/>
       <w:lvlJc w:val="left"/>
     </w:lvl>
-    <w:lvl w:ilvl="6" w:tplc="8B02534A">
+    <w:lvl w:ilvl="6" w:tplc="50FE73F0">
       <w:numFmt w:val="decimal"/>
       <w:lvlText w:val=""/>
       <w:lvlJc w:val="left"/>
     </w:lvl>
-    <w:lvl w:ilvl="7" w:tplc="D7CA162C">
+    <w:lvl w:ilvl="7" w:tplc="1F566DD8">
       <w:numFmt w:val="decimal"/>
       <w:lvlText w:val=""/>
       <w:lvlJc w:val="left"/>
     </w:lvl>
-    <w:lvl w:ilvl="8" w:tplc="1ABE2EA6">
-      <w:numFmt w:val="decimal"/>
-      <w:lvlText w:val=""/>
-      <w:lvlJc w:val="left"/>
-    </w:lvl>
-  </w:abstractNum>
-  <w:abstractNum w:abstractNumId="6" w15:restartNumberingAfterBreak="0">
-    <w:nsid w:val="617520AA"/>
-    <w:multiLevelType w:val="hybridMultilevel"/>
-    <w:tmpl w:val="BDE2217A"/>
-    <w:lvl w:ilvl="0" w:tplc="A3707DBA">
-      <w:start w:val="1"/>
-      <w:numFmt w:val="decimal"/>
-      <w:lvlText w:val="%1."/>
-      <w:lvlJc w:val="left"/>
-      <w:pPr>
-        <w:ind w:left="540" w:hanging="360"/>
-      </w:pPr>
-    </w:lvl>
-    <w:lvl w:ilvl="1" w:tplc="C748A2AC">
-      <w:numFmt w:val="decimal"/>
-      <w:lvlText w:val=""/>
-      <w:lvlJc w:val="left"/>
-    </w:lvl>
-    <w:lvl w:ilvl="2" w:tplc="49582434">
-      <w:numFmt w:val="decimal"/>
-      <w:lvlText w:val=""/>
-      <w:lvlJc w:val="left"/>
-    </w:lvl>
-    <w:lvl w:ilvl="3" w:tplc="22FC8AD4">
-      <w:numFmt w:val="decimal"/>
-      <w:lvlText w:val=""/>
-      <w:lvlJc w:val="left"/>
-    </w:lvl>
-    <w:lvl w:ilvl="4" w:tplc="5F64F230">
-      <w:numFmt w:val="decimal"/>
-      <w:lvlText w:val=""/>
-      <w:lvlJc w:val="left"/>
-    </w:lvl>
-    <w:lvl w:ilvl="5" w:tplc="A80E8EE2">
-      <w:numFmt w:val="decimal"/>
-      <w:lvlText w:val=""/>
-      <w:lvlJc w:val="left"/>
-    </w:lvl>
-    <w:lvl w:ilvl="6" w:tplc="F22AC18A">
-      <w:numFmt w:val="decimal"/>
-      <w:lvlText w:val=""/>
-      <w:lvlJc w:val="left"/>
-    </w:lvl>
-    <w:lvl w:ilvl="7" w:tplc="46C20A92">
-      <w:numFmt w:val="decimal"/>
-      <w:lvlText w:val=""/>
-      <w:lvlJc w:val="left"/>
-    </w:lvl>
-    <w:lvl w:ilvl="8" w:tplc="C0200728">
+    <w:lvl w:ilvl="8" w:tplc="95E4F7CC">
       <w:numFmt w:val="decimal"/>
       <w:lvlText w:val=""/>
       <w:lvlJc w:val="left"/>
     </w:lvl>
   </w:abstractNum>
   <w:abstractNum w:abstractNumId="7" w15:restartNumberingAfterBreak="0">
-    <w:nsid w:val="668E1F90"/>
+    <w:nsid w:val="6D203FEA"/>
     <w:multiLevelType w:val="hybridMultilevel"/>
-    <w:tmpl w:val="17568508"/>
-    <w:lvl w:ilvl="0" w:tplc="2C4CA45A">
-      <w:start w:val="1"/>
-      <w:numFmt w:val="decimal"/>
-      <w:lvlText w:val="%1."/>
-      <w:lvlJc w:val="left"/>
-      <w:pPr>
-        <w:ind w:left="540" w:hanging="360"/>
-      </w:pPr>
-    </w:lvl>
-    <w:lvl w:ilvl="1" w:tplc="7C5899CE">
-      <w:numFmt w:val="decimal"/>
-      <w:lvlText w:val=""/>
-      <w:lvlJc w:val="left"/>
-    </w:lvl>
-    <w:lvl w:ilvl="2" w:tplc="1CC8A6DE">
-      <w:numFmt w:val="decimal"/>
-      <w:lvlText w:val=""/>
-      <w:lvlJc w:val="left"/>
-    </w:lvl>
-    <w:lvl w:ilvl="3" w:tplc="2A242244">
-      <w:numFmt w:val="decimal"/>
-      <w:lvlText w:val=""/>
-      <w:lvlJc w:val="left"/>
-    </w:lvl>
-    <w:lvl w:ilvl="4" w:tplc="1170614A">
-      <w:numFmt w:val="decimal"/>
-      <w:lvlText w:val=""/>
-      <w:lvlJc w:val="left"/>
-    </w:lvl>
-    <w:lvl w:ilvl="5" w:tplc="A9907556">
-      <w:numFmt w:val="decimal"/>
-      <w:lvlText w:val=""/>
-      <w:lvlJc w:val="left"/>
-    </w:lvl>
-    <w:lvl w:ilvl="6" w:tplc="FF5CF3A2">
-      <w:numFmt w:val="decimal"/>
-      <w:lvlText w:val=""/>
-      <w:lvlJc w:val="left"/>
-    </w:lvl>
-    <w:lvl w:ilvl="7" w:tplc="1D9E8E1A">
-      <w:numFmt w:val="decimal"/>
-      <w:lvlText w:val=""/>
-      <w:lvlJc w:val="left"/>
-    </w:lvl>
-    <w:lvl w:ilvl="8" w:tplc="E042F174">
-      <w:numFmt w:val="decimal"/>
-      <w:lvlText w:val=""/>
-      <w:lvlJc w:val="left"/>
-    </w:lvl>
-  </w:abstractNum>
-  <w:abstractNum w:abstractNumId="8" w15:restartNumberingAfterBreak="0">
-    <w:nsid w:val="701C21EB"/>
-    <w:multiLevelType w:val="hybridMultilevel"/>
-    <w:tmpl w:val="DAA0B02E"/>
-    <w:lvl w:ilvl="0" w:tplc="7AAC9A8C" w:tentative="1">
+    <w:tmpl w:val="88CC5CBE"/>
+    <w:lvl w:ilvl="0" w:tplc="81841574" w:tentative="1">
       <w:start w:val="1"/>
       <w:numFmt w:val="bullet"/>
       <w:lvlText w:val="●"/>
@@ -36977,7 +37853,7 @@
         <w:ind w:left="720" w:hanging="360"/>
       </w:pPr>
     </w:lvl>
-    <w:lvl w:ilvl="1" w:tplc="7796108C" w:tentative="1">
+    <w:lvl w:ilvl="1" w:tplc="45182558" w:tentative="1">
       <w:start w:val="1"/>
       <w:numFmt w:val="bullet"/>
       <w:lvlText w:val="○"/>
@@ -36986,7 +37862,7 @@
         <w:ind w:left="1440" w:hanging="360"/>
       </w:pPr>
     </w:lvl>
-    <w:lvl w:ilvl="2" w:tplc="2B2CBFF6" w:tentative="1">
+    <w:lvl w:ilvl="2" w:tplc="E77AEEA0" w:tentative="1">
       <w:start w:val="1"/>
       <w:numFmt w:val="bullet"/>
       <w:lvlText w:val="■"/>
@@ -36995,7 +37871,7 @@
         <w:ind w:left="2160" w:hanging="360"/>
       </w:pPr>
     </w:lvl>
-    <w:lvl w:ilvl="3" w:tplc="F88E052A" w:tentative="1">
+    <w:lvl w:ilvl="3" w:tplc="08223B76" w:tentative="1">
       <w:start w:val="1"/>
       <w:numFmt w:val="bullet"/>
       <w:lvlText w:val="●"/>
@@ -37004,7 +37880,7 @@
         <w:ind w:left="2880" w:hanging="360"/>
       </w:pPr>
     </w:lvl>
-    <w:lvl w:ilvl="4" w:tplc="9046461C" w:tentative="1">
+    <w:lvl w:ilvl="4" w:tplc="6D108FD8" w:tentative="1">
       <w:start w:val="1"/>
       <w:numFmt w:val="bullet"/>
       <w:lvlText w:val="○"/>
@@ -37013,7 +37889,7 @@
         <w:ind w:left="3600" w:hanging="360"/>
       </w:pPr>
     </w:lvl>
-    <w:lvl w:ilvl="5" w:tplc="047A0DC0" w:tentative="1">
+    <w:lvl w:ilvl="5" w:tplc="C49414FC" w:tentative="1">
       <w:start w:val="1"/>
       <w:numFmt w:val="bullet"/>
       <w:lvlText w:val="■"/>
@@ -37022,7 +37898,7 @@
         <w:ind w:left="4320" w:hanging="360"/>
       </w:pPr>
     </w:lvl>
-    <w:lvl w:ilvl="6" w:tplc="F50A0DFC" w:tentative="1">
+    <w:lvl w:ilvl="6" w:tplc="5A7A8896" w:tentative="1">
       <w:start w:val="1"/>
       <w:numFmt w:val="bullet"/>
       <w:lvlText w:val="●"/>
@@ -37031,7 +37907,7 @@
         <w:ind w:left="5040" w:hanging="360"/>
       </w:pPr>
     </w:lvl>
-    <w:lvl w:ilvl="7" w:tplc="B95A394C" w:tentative="1">
+    <w:lvl w:ilvl="7" w:tplc="7EC26B34" w:tentative="1">
       <w:start w:val="1"/>
       <w:numFmt w:val="bullet"/>
       <w:lvlText w:val="●"/>
@@ -37040,7 +37916,7 @@
         <w:ind w:left="5760" w:hanging="360"/>
       </w:pPr>
     </w:lvl>
-    <w:lvl w:ilvl="8" w:tplc="A50C3D4C" w:tentative="1">
+    <w:lvl w:ilvl="8" w:tplc="31922770" w:tentative="1">
       <w:start w:val="1"/>
       <w:numFmt w:val="bullet"/>
       <w:lvlText w:val="●"/>
@@ -37050,55 +37926,109 @@
       </w:pPr>
     </w:lvl>
   </w:abstractNum>
-  <w:num w:numId="1" w16cid:durableId="1506088794">
+  <w:abstractNum w:abstractNumId="8" w15:restartNumberingAfterBreak="0">
+    <w:nsid w:val="7B9306AA"/>
+    <w:multiLevelType w:val="hybridMultilevel"/>
+    <w:tmpl w:val="C4D8068C"/>
+    <w:lvl w:ilvl="0" w:tplc="979EEFC8">
+      <w:start w:val="1"/>
+      <w:numFmt w:val="decimal"/>
+      <w:lvlText w:val="%1."/>
+      <w:lvlJc w:val="left"/>
+      <w:pPr>
+        <w:ind w:left="540" w:hanging="360"/>
+      </w:pPr>
+    </w:lvl>
+    <w:lvl w:ilvl="1" w:tplc="68423DA2">
+      <w:numFmt w:val="decimal"/>
+      <w:lvlText w:val=""/>
+      <w:lvlJc w:val="left"/>
+    </w:lvl>
+    <w:lvl w:ilvl="2" w:tplc="D5887382">
+      <w:numFmt w:val="decimal"/>
+      <w:lvlText w:val=""/>
+      <w:lvlJc w:val="left"/>
+    </w:lvl>
+    <w:lvl w:ilvl="3" w:tplc="D144B6EE">
+      <w:numFmt w:val="decimal"/>
+      <w:lvlText w:val=""/>
+      <w:lvlJc w:val="left"/>
+    </w:lvl>
+    <w:lvl w:ilvl="4" w:tplc="43C8AC46">
+      <w:numFmt w:val="decimal"/>
+      <w:lvlText w:val=""/>
+      <w:lvlJc w:val="left"/>
+    </w:lvl>
+    <w:lvl w:ilvl="5" w:tplc="9D1220F4">
+      <w:numFmt w:val="decimal"/>
+      <w:lvlText w:val=""/>
+      <w:lvlJc w:val="left"/>
+    </w:lvl>
+    <w:lvl w:ilvl="6" w:tplc="BC84B7CE">
+      <w:numFmt w:val="decimal"/>
+      <w:lvlText w:val=""/>
+      <w:lvlJc w:val="left"/>
+    </w:lvl>
+    <w:lvl w:ilvl="7" w:tplc="D826C606">
+      <w:numFmt w:val="decimal"/>
+      <w:lvlText w:val=""/>
+      <w:lvlJc w:val="left"/>
+    </w:lvl>
+    <w:lvl w:ilvl="8" w:tplc="65A4C364">
+      <w:numFmt w:val="decimal"/>
+      <w:lvlText w:val=""/>
+      <w:lvlJc w:val="left"/>
+    </w:lvl>
+  </w:abstractNum>
+  <w:num w:numId="1" w16cid:durableId="489256461">
+    <w:abstractNumId w:val="7"/>
+    <w:lvlOverride w:ilvl="0">
+      <w:startOverride w:val="1"/>
+    </w:lvlOverride>
+  </w:num>
+  <w:num w:numId="2" w16cid:durableId="730079838">
+    <w:abstractNumId w:val="3"/>
+    <w:lvlOverride w:ilvl="0">
+      <w:startOverride w:val="1"/>
+    </w:lvlOverride>
+  </w:num>
+  <w:num w:numId="3" w16cid:durableId="1052386956">
     <w:abstractNumId w:val="8"/>
     <w:lvlOverride w:ilvl="0">
       <w:startOverride w:val="1"/>
     </w:lvlOverride>
   </w:num>
-  <w:num w:numId="2" w16cid:durableId="932277955">
+  <w:num w:numId="4" w16cid:durableId="175533960">
     <w:abstractNumId w:val="2"/>
     <w:lvlOverride w:ilvl="0">
       <w:startOverride w:val="1"/>
     </w:lvlOverride>
   </w:num>
-  <w:num w:numId="3" w16cid:durableId="394357365">
-    <w:abstractNumId w:val="3"/>
+  <w:num w:numId="5" w16cid:durableId="362050350">
+    <w:abstractNumId w:val="6"/>
     <w:lvlOverride w:ilvl="0">
       <w:startOverride w:val="1"/>
     </w:lvlOverride>
   </w:num>
-  <w:num w:numId="4" w16cid:durableId="1834298008">
-    <w:abstractNumId w:val="7"/>
+  <w:num w:numId="6" w16cid:durableId="2076585338">
+    <w:abstractNumId w:val="0"/>
     <w:lvlOverride w:ilvl="0">
       <w:startOverride w:val="1"/>
     </w:lvlOverride>
   </w:num>
-  <w:num w:numId="5" w16cid:durableId="1015957222">
+  <w:num w:numId="7" w16cid:durableId="1863589037">
+    <w:abstractNumId w:val="5"/>
+    <w:lvlOverride w:ilvl="0">
+      <w:startOverride w:val="1"/>
+    </w:lvlOverride>
+  </w:num>
+  <w:num w:numId="8" w16cid:durableId="1620985224">
     <w:abstractNumId w:val="1"/>
     <w:lvlOverride w:ilvl="0">
       <w:startOverride w:val="1"/>
     </w:lvlOverride>
   </w:num>
-  <w:num w:numId="6" w16cid:durableId="307630263">
-    <w:abstractNumId w:val="0"/>
-    <w:lvlOverride w:ilvl="0">
-      <w:startOverride w:val="1"/>
-    </w:lvlOverride>
-  </w:num>
-  <w:num w:numId="7" w16cid:durableId="1359282660">
-    <w:abstractNumId w:val="6"/>
-    <w:lvlOverride w:ilvl="0">
-      <w:startOverride w:val="1"/>
-    </w:lvlOverride>
-  </w:num>
-  <w:num w:numId="8" w16cid:durableId="295990307">
-    <w:abstractNumId w:val="5"/>
-    <w:lvlOverride w:ilvl="0">
-      <w:startOverride w:val="1"/>
-    </w:lvlOverride>
-  </w:num>
-  <w:num w:numId="9" w16cid:durableId="1626041512">
+  <w:num w:numId="9" w16cid:durableId="119225575">
     <w:abstractNumId w:val="4"/>
     <w:lvlOverride w:ilvl="0">
       <w:startOverride w:val="1"/>
@@ -37739,7 +38669,7 @@
     <w:autoRedefine/>
     <w:uiPriority w:val="39"/>
     <w:unhideWhenUsed/>
-    <w:rsid w:val="00DE4F0D"/>
+    <w:rsid w:val="00115F24"/>
     <w:pPr>
       <w:spacing w:after="100"/>
     </w:pPr>
@@ -37751,7 +38681,7 @@
     <w:autoRedefine/>
     <w:uiPriority w:val="39"/>
     <w:unhideWhenUsed/>
-    <w:rsid w:val="00DE4F0D"/>
+    <w:rsid w:val="00115F24"/>
     <w:pPr>
       <w:spacing w:after="100"/>
       <w:ind w:left="220"/>

</xml_diff>